<commit_message>
fix sources & add tests
</commit_message>
<xml_diff>
--- a/ТО02.docx
+++ b/ТО02.docx
@@ -1,6 +1,6 @@
 
 <file path=word/document.xml><?xml version="1.0" encoding="utf-8"?>
-<w:document xmlns:wpc="http://schemas.microsoft.com/office/word/2010/wordprocessingCanvas" xmlns:cx="http://schemas.microsoft.com/office/drawing/2014/chartex" xmlns:mc="http://schemas.openxmlformats.org/markup-compatibility/2006" xmlns:o="urn:schemas-microsoft-com:office:office" xmlns:r="http://schemas.openxmlformats.org/officeDocument/2006/relationships" xmlns:m="http://schemas.openxmlformats.org/officeDocument/2006/math" xmlns:v="urn:schemas-microsoft-com:vml" xmlns:wp14="http://schemas.microsoft.com/office/word/2010/wordprocessingDrawing" xmlns:wp="http://schemas.openxmlformats.org/drawingml/2006/wordprocessingDrawing" xmlns:w10="urn:schemas-microsoft-com:office:word" xmlns:w="http://schemas.openxmlformats.org/wordprocessingml/2006/main" xmlns:w14="http://schemas.microsoft.com/office/word/2010/wordml" xmlns:w15="http://schemas.microsoft.com/office/word/2012/wordml" xmlns:w16se="http://schemas.microsoft.com/office/word/2015/wordml/symex" xmlns:wpg="http://schemas.microsoft.com/office/word/2010/wordprocessingGroup" xmlns:wpi="http://schemas.microsoft.com/office/word/2010/wordprocessingInk" xmlns:wne="http://schemas.microsoft.com/office/word/2006/wordml" xmlns:wps="http://schemas.microsoft.com/office/word/2010/wordprocessingShape" mc:Ignorable="w14 w15 w16se wp14">
+<w:document xmlns:wpc="http://schemas.microsoft.com/office/word/2010/wordprocessingCanvas" xmlns:cx="http://schemas.microsoft.com/office/drawing/2014/chartex" xmlns:cx1="http://schemas.microsoft.com/office/drawing/2015/9/8/chartex" xmlns:cx2="http://schemas.microsoft.com/office/drawing/2015/10/21/chartex" xmlns:cx3="http://schemas.microsoft.com/office/drawing/2016/5/9/chartex" xmlns:cx4="http://schemas.microsoft.com/office/drawing/2016/5/10/chartex" xmlns:cx5="http://schemas.microsoft.com/office/drawing/2016/5/11/chartex" xmlns:cx6="http://schemas.microsoft.com/office/drawing/2016/5/12/chartex" xmlns:cx7="http://schemas.microsoft.com/office/drawing/2016/5/13/chartex" xmlns:cx8="http://schemas.microsoft.com/office/drawing/2016/5/14/chartex" xmlns:mc="http://schemas.openxmlformats.org/markup-compatibility/2006" xmlns:aink="http://schemas.microsoft.com/office/drawing/2016/ink" xmlns:am3d="http://schemas.microsoft.com/office/drawing/2017/model3d" xmlns:o="urn:schemas-microsoft-com:office:office" xmlns:oel="http://schemas.microsoft.com/office/2019/extlst" xmlns:r="http://schemas.openxmlformats.org/officeDocument/2006/relationships" xmlns:m="http://schemas.openxmlformats.org/officeDocument/2006/math" xmlns:v="urn:schemas-microsoft-com:vml" xmlns:wp14="http://schemas.microsoft.com/office/word/2010/wordprocessingDrawing" xmlns:wp="http://schemas.openxmlformats.org/drawingml/2006/wordprocessingDrawing" xmlns:w10="urn:schemas-microsoft-com:office:word" xmlns:w="http://schemas.openxmlformats.org/wordprocessingml/2006/main" xmlns:w14="http://schemas.microsoft.com/office/word/2010/wordml" xmlns:w15="http://schemas.microsoft.com/office/word/2012/wordml" xmlns:w16cex="http://schemas.microsoft.com/office/word/2018/wordml/cex" xmlns:w16cid="http://schemas.microsoft.com/office/word/2016/wordml/cid" xmlns:w16="http://schemas.microsoft.com/office/word/2018/wordml" xmlns:w16du="http://schemas.microsoft.com/office/word/2023/wordml/word16du" xmlns:w16sdtdh="http://schemas.microsoft.com/office/word/2020/wordml/sdtdatahash" xmlns:w16sdtfl="http://schemas.microsoft.com/office/word/2024/wordml/sdtformatlock" xmlns:w16se="http://schemas.microsoft.com/office/word/2015/wordml/symex" xmlns:wpg="http://schemas.microsoft.com/office/word/2010/wordprocessingGroup" xmlns:wpi="http://schemas.microsoft.com/office/word/2010/wordprocessingInk" xmlns:wne="http://schemas.microsoft.com/office/word/2006/wordml" xmlns:wps="http://schemas.microsoft.com/office/word/2010/wordprocessingShape" mc:Ignorable="w14 w15 w16se w16cid w16 w16cex w16sdtdh w16sdtfl w16du wp14">
   <w:body>
     <w:sdt>
       <w:sdtPr>
@@ -1701,7 +1701,7 @@
     </w:sdt>
     <w:p>
       <w:pPr>
-        <w:pStyle w:val="af8"/>
+        <w:pStyle w:val="a5"/>
       </w:pPr>
       <w:r>
         <w:lastRenderedPageBreak/>
@@ -1710,7 +1710,7 @@
     </w:p>
     <w:p>
       <w:pPr>
-        <w:pStyle w:val="12"/>
+        <w:pStyle w:val="TOC1"/>
         <w:tabs>
           <w:tab w:val="right" w:leader="dot" w:pos="9344"/>
         </w:tabs>
@@ -1734,7 +1734,7 @@
       <w:hyperlink w:anchor="_Toc226770179" w:history="1">
         <w:r>
           <w:rPr>
-            <w:rStyle w:val="af7"/>
+            <w:rStyle w:val="Hyperlink"/>
             <w:noProof/>
           </w:rPr>
           <w:t>Перечень сокращений и обозначений</w:t>
@@ -1791,7 +1791,7 @@
     </w:p>
     <w:p>
       <w:pPr>
-        <w:pStyle w:val="12"/>
+        <w:pStyle w:val="TOC1"/>
         <w:tabs>
           <w:tab w:val="right" w:leader="dot" w:pos="9344"/>
         </w:tabs>
@@ -1806,7 +1806,7 @@
       <w:hyperlink w:anchor="_Toc226770180" w:history="1">
         <w:r>
           <w:rPr>
-            <w:rStyle w:val="af7"/>
+            <w:rStyle w:val="Hyperlink"/>
             <w:noProof/>
           </w:rPr>
           <w:t>Введение</w:t>
@@ -1863,7 +1863,7 @@
     </w:p>
     <w:p>
       <w:pPr>
-        <w:pStyle w:val="12"/>
+        <w:pStyle w:val="TOC1"/>
         <w:tabs>
           <w:tab w:val="right" w:leader="dot" w:pos="9344"/>
         </w:tabs>
@@ -1878,7 +1878,7 @@
       <w:hyperlink w:anchor="_Toc226770181" w:history="1">
         <w:r>
           <w:rPr>
-            <w:rStyle w:val="af7"/>
+            <w:rStyle w:val="Hyperlink"/>
             <w:noProof/>
           </w:rPr>
           <w:t>1 Охрана труда и техника безопасности при работе на ПК</w:t>
@@ -1935,7 +1935,7 @@
     </w:p>
     <w:p>
       <w:pPr>
-        <w:pStyle w:val="23"/>
+        <w:pStyle w:val="TOC2"/>
         <w:rPr>
           <w:rFonts w:asciiTheme="minorHAnsi" w:eastAsiaTheme="minorEastAsia" w:hAnsiTheme="minorHAnsi"/>
           <w:noProof/>
@@ -1947,7 +1947,7 @@
       <w:hyperlink w:anchor="_Toc226770182" w:history="1">
         <w:r>
           <w:rPr>
-            <w:rStyle w:val="af7"/>
+            <w:rStyle w:val="Hyperlink"/>
             <w:rFonts w:eastAsia="Times New Roman"/>
             <w:noProof/>
           </w:rPr>
@@ -1955,7 +1955,7 @@
         </w:r>
         <w:r>
           <w:rPr>
-            <w:rStyle w:val="af7"/>
+            <w:rStyle w:val="Hyperlink"/>
             <w:noProof/>
           </w:rPr>
           <w:t xml:space="preserve"> Общие требования безопасности</w:t>
@@ -2012,7 +2012,7 @@
     </w:p>
     <w:p>
       <w:pPr>
-        <w:pStyle w:val="23"/>
+        <w:pStyle w:val="TOC2"/>
         <w:rPr>
           <w:rFonts w:asciiTheme="minorHAnsi" w:eastAsiaTheme="minorEastAsia" w:hAnsiTheme="minorHAnsi"/>
           <w:noProof/>
@@ -2024,7 +2024,7 @@
       <w:hyperlink w:anchor="_Toc226770183" w:history="1">
         <w:r>
           <w:rPr>
-            <w:rStyle w:val="af7"/>
+            <w:rStyle w:val="Hyperlink"/>
             <w:rFonts w:eastAsia="Times New Roman"/>
             <w:noProof/>
           </w:rPr>
@@ -2082,7 +2082,7 @@
     </w:p>
     <w:p>
       <w:pPr>
-        <w:pStyle w:val="23"/>
+        <w:pStyle w:val="TOC2"/>
         <w:rPr>
           <w:rFonts w:asciiTheme="minorHAnsi" w:eastAsiaTheme="minorEastAsia" w:hAnsiTheme="minorHAnsi"/>
           <w:noProof/>
@@ -2094,7 +2094,7 @@
       <w:hyperlink w:anchor="_Toc226770184" w:history="1">
         <w:r>
           <w:rPr>
-            <w:rStyle w:val="af7"/>
+            <w:rStyle w:val="Hyperlink"/>
             <w:rFonts w:eastAsia="Times New Roman"/>
             <w:noProof/>
           </w:rPr>
@@ -2152,7 +2152,7 @@
     </w:p>
     <w:p>
       <w:pPr>
-        <w:pStyle w:val="12"/>
+        <w:pStyle w:val="TOC1"/>
         <w:tabs>
           <w:tab w:val="right" w:leader="dot" w:pos="9344"/>
         </w:tabs>
@@ -2167,7 +2167,7 @@
       <w:hyperlink w:anchor="_Toc226770185" w:history="1">
         <w:r>
           <w:rPr>
-            <w:rStyle w:val="af7"/>
+            <w:rStyle w:val="Hyperlink"/>
             <w:noProof/>
             <w:lang w:val="en-US"/>
           </w:rPr>
@@ -2175,14 +2175,14 @@
         </w:r>
         <w:r>
           <w:rPr>
-            <w:rStyle w:val="af7"/>
+            <w:rStyle w:val="Hyperlink"/>
             <w:noProof/>
           </w:rPr>
           <w:t xml:space="preserve"> Выполнение</w:t>
         </w:r>
         <w:r>
           <w:rPr>
-            <w:rStyle w:val="af7"/>
+            <w:rStyle w:val="Hyperlink"/>
             <w:noProof/>
             <w:lang w:val="en-US"/>
           </w:rPr>
@@ -2190,14 +2190,14 @@
         </w:r>
         <w:r>
           <w:rPr>
-            <w:rStyle w:val="af7"/>
+            <w:rStyle w:val="Hyperlink"/>
             <w:noProof/>
           </w:rPr>
           <w:t>работ</w:t>
         </w:r>
         <w:r>
           <w:rPr>
-            <w:rStyle w:val="af7"/>
+            <w:rStyle w:val="Hyperlink"/>
             <w:noProof/>
             <w:lang w:val="en-US"/>
           </w:rPr>
@@ -2205,14 +2205,14 @@
         </w:r>
         <w:r>
           <w:rPr>
-            <w:rStyle w:val="af7"/>
+            <w:rStyle w:val="Hyperlink"/>
             <w:noProof/>
           </w:rPr>
           <w:t>по</w:t>
         </w:r>
         <w:r>
           <w:rPr>
-            <w:rStyle w:val="af7"/>
+            <w:rStyle w:val="Hyperlink"/>
             <w:noProof/>
             <w:lang w:val="en-US"/>
           </w:rPr>
@@ -2220,14 +2220,14 @@
         </w:r>
         <w:r>
           <w:rPr>
-            <w:rStyle w:val="af7"/>
+            <w:rStyle w:val="Hyperlink"/>
             <w:noProof/>
           </w:rPr>
           <w:t>ПМ</w:t>
         </w:r>
         <w:r>
           <w:rPr>
-            <w:rStyle w:val="af7"/>
+            <w:rStyle w:val="Hyperlink"/>
             <w:noProof/>
             <w:lang w:val="en-US"/>
           </w:rPr>
@@ -2285,7 +2285,7 @@
     </w:p>
     <w:p>
       <w:pPr>
-        <w:pStyle w:val="23"/>
+        <w:pStyle w:val="TOC2"/>
         <w:rPr>
           <w:rFonts w:asciiTheme="minorHAnsi" w:eastAsiaTheme="minorEastAsia" w:hAnsiTheme="minorHAnsi"/>
           <w:noProof/>
@@ -2297,7 +2297,7 @@
       <w:hyperlink w:anchor="_Toc226770186" w:history="1">
         <w:r>
           <w:rPr>
-            <w:rStyle w:val="af7"/>
+            <w:rStyle w:val="Hyperlink"/>
             <w:noProof/>
           </w:rPr>
           <w:t>2.1 Анализ и разработка требований</w:t>
@@ -2354,7 +2354,7 @@
     </w:p>
     <w:p>
       <w:pPr>
-        <w:pStyle w:val="23"/>
+        <w:pStyle w:val="TOC2"/>
         <w:rPr>
           <w:rFonts w:asciiTheme="minorHAnsi" w:eastAsiaTheme="minorEastAsia" w:hAnsiTheme="minorHAnsi"/>
           <w:noProof/>
@@ -2366,7 +2366,7 @@
       <w:hyperlink w:anchor="_Toc226770187" w:history="1">
         <w:r>
           <w:rPr>
-            <w:rStyle w:val="af7"/>
+            <w:rStyle w:val="Hyperlink"/>
             <w:noProof/>
           </w:rPr>
           <w:t>2.2 Выбор состава программных и технических средств</w:t>
@@ -2423,7 +2423,7 @@
     </w:p>
     <w:p>
       <w:pPr>
-        <w:pStyle w:val="23"/>
+        <w:pStyle w:val="TOC2"/>
         <w:rPr>
           <w:rFonts w:asciiTheme="minorHAnsi" w:eastAsiaTheme="minorEastAsia" w:hAnsiTheme="minorHAnsi"/>
           <w:noProof/>
@@ -2435,7 +2435,7 @@
       <w:hyperlink w:anchor="_Toc226770188" w:history="1">
         <w:r>
           <w:rPr>
-            <w:rStyle w:val="af7"/>
+            <w:rStyle w:val="Hyperlink"/>
             <w:noProof/>
           </w:rPr>
           <w:t>2.3 Проектирование программного обеспечения</w:t>
@@ -2492,7 +2492,7 @@
     </w:p>
     <w:p>
       <w:pPr>
-        <w:pStyle w:val="23"/>
+        <w:pStyle w:val="TOC2"/>
         <w:rPr>
           <w:rFonts w:asciiTheme="minorHAnsi" w:eastAsiaTheme="minorEastAsia" w:hAnsiTheme="minorHAnsi"/>
           <w:noProof/>
@@ -2504,7 +2504,7 @@
       <w:hyperlink w:anchor="_Toc226770189" w:history="1">
         <w:r>
           <w:rPr>
-            <w:rStyle w:val="af7"/>
+            <w:rStyle w:val="Hyperlink"/>
             <w:noProof/>
           </w:rPr>
           <w:t>2.4 Разработка и интеграция программных модулей</w:t>
@@ -2561,7 +2561,7 @@
     </w:p>
     <w:p>
       <w:pPr>
-        <w:pStyle w:val="23"/>
+        <w:pStyle w:val="TOC2"/>
         <w:rPr>
           <w:rFonts w:asciiTheme="minorHAnsi" w:eastAsiaTheme="minorEastAsia" w:hAnsiTheme="minorHAnsi"/>
           <w:noProof/>
@@ -2573,14 +2573,14 @@
       <w:hyperlink w:anchor="_Toc226770190" w:history="1">
         <w:r>
           <w:rPr>
-            <w:rStyle w:val="af7"/>
+            <w:rStyle w:val="Hyperlink"/>
             <w:noProof/>
           </w:rPr>
           <w:t xml:space="preserve">2.5 Описание работы с </w:t>
         </w:r>
         <w:r>
           <w:rPr>
-            <w:rStyle w:val="af7"/>
+            <w:rStyle w:val="Hyperlink"/>
             <w:noProof/>
             <w:lang w:val="en-US"/>
           </w:rPr>
@@ -2588,7 +2588,7 @@
         </w:r>
         <w:r>
           <w:rPr>
-            <w:rStyle w:val="af7"/>
+            <w:rStyle w:val="Hyperlink"/>
             <w:noProof/>
           </w:rPr>
           <w:t xml:space="preserve"> и проверка соответствия стандартам кодирования</w:t>
@@ -2645,7 +2645,7 @@
     </w:p>
     <w:p>
       <w:pPr>
-        <w:pStyle w:val="23"/>
+        <w:pStyle w:val="TOC2"/>
         <w:rPr>
           <w:rFonts w:asciiTheme="minorHAnsi" w:eastAsiaTheme="minorEastAsia" w:hAnsiTheme="minorHAnsi"/>
           <w:noProof/>
@@ -2657,7 +2657,7 @@
       <w:hyperlink w:anchor="_Toc226770191" w:history="1">
         <w:r>
           <w:rPr>
-            <w:rStyle w:val="af7"/>
+            <w:rStyle w:val="Hyperlink"/>
             <w:noProof/>
           </w:rPr>
           <w:t>2.6 Отладка и тестирование программных модулей</w:t>
@@ -2714,7 +2714,7 @@
     </w:p>
     <w:p>
       <w:pPr>
-        <w:pStyle w:val="12"/>
+        <w:pStyle w:val="TOC1"/>
         <w:tabs>
           <w:tab w:val="right" w:leader="dot" w:pos="9344"/>
         </w:tabs>
@@ -2729,7 +2729,7 @@
       <w:hyperlink w:anchor="_Toc226770192" w:history="1">
         <w:r>
           <w:rPr>
-            <w:rStyle w:val="af7"/>
+            <w:rStyle w:val="Hyperlink"/>
             <w:noProof/>
           </w:rPr>
           <w:t>Заключение</w:t>
@@ -2786,7 +2786,7 @@
     </w:p>
     <w:p>
       <w:pPr>
-        <w:pStyle w:val="12"/>
+        <w:pStyle w:val="TOC1"/>
         <w:tabs>
           <w:tab w:val="right" w:leader="dot" w:pos="9344"/>
         </w:tabs>
@@ -2801,7 +2801,7 @@
       <w:hyperlink w:anchor="_Toc226770193" w:history="1">
         <w:r>
           <w:rPr>
-            <w:rStyle w:val="af7"/>
+            <w:rStyle w:val="Hyperlink"/>
             <w:noProof/>
           </w:rPr>
           <w:t>Список использованных источников</w:t>
@@ -2863,7 +2863,7 @@
     </w:p>
     <w:p>
       <w:pPr>
-        <w:pStyle w:val="10"/>
+        <w:pStyle w:val="Heading1"/>
         <w:numPr>
           <w:ilvl w:val="0"/>
           <w:numId w:val="0"/>
@@ -2884,7 +2884,7 @@
     </w:p>
     <w:p>
       <w:pPr>
-        <w:pStyle w:val="a3"/>
+        <w:pStyle w:val="a2"/>
       </w:pPr>
       <w:r>
         <w:t xml:space="preserve">В настоящем </w:t>
@@ -2904,7 +2904,7 @@
     </w:p>
     <w:p>
       <w:pPr>
-        <w:pStyle w:val="a3"/>
+        <w:pStyle w:val="a2"/>
         <w:widowControl w:val="0"/>
         <w:rPr>
           <w:rFonts w:eastAsia="Times New Roman" w:cs="Times New Roman"/>
@@ -2921,7 +2921,7 @@
     </w:p>
     <w:p>
       <w:pPr>
-        <w:pStyle w:val="a3"/>
+        <w:pStyle w:val="a2"/>
         <w:widowControl w:val="0"/>
         <w:rPr>
           <w:rFonts w:eastAsia="Times New Roman" w:cs="Times New Roman"/>
@@ -2952,7 +2952,7 @@
     </w:p>
     <w:p>
       <w:pPr>
-        <w:pStyle w:val="a3"/>
+        <w:pStyle w:val="a2"/>
         <w:widowControl w:val="0"/>
         <w:rPr>
           <w:rFonts w:eastAsia="Times New Roman" w:cs="Times New Roman"/>
@@ -2969,7 +2969,7 @@
     </w:p>
     <w:p>
       <w:pPr>
-        <w:pStyle w:val="a3"/>
+        <w:pStyle w:val="a2"/>
         <w:widowControl w:val="0"/>
         <w:rPr>
           <w:rFonts w:eastAsia="Times New Roman" w:cs="Times New Roman"/>
@@ -3000,7 +3000,7 @@
     </w:p>
     <w:p>
       <w:pPr>
-        <w:pStyle w:val="a3"/>
+        <w:pStyle w:val="a2"/>
         <w:widowControl w:val="0"/>
         <w:rPr>
           <w:rFonts w:eastAsia="Times New Roman" w:cs="Times New Roman"/>
@@ -3031,7 +3031,7 @@
     </w:p>
     <w:p>
       <w:pPr>
-        <w:pStyle w:val="a3"/>
+        <w:pStyle w:val="a2"/>
         <w:widowControl w:val="0"/>
         <w:rPr>
           <w:rFonts w:eastAsia="Times New Roman" w:cs="Times New Roman"/>
@@ -3083,7 +3083,7 @@
     </w:p>
     <w:p>
       <w:pPr>
-        <w:pStyle w:val="a3"/>
+        <w:pStyle w:val="a2"/>
         <w:widowControl w:val="0"/>
         <w:rPr>
           <w:rFonts w:eastAsia="Times New Roman" w:cs="Times New Roman"/>
@@ -3156,7 +3156,7 @@
     </w:p>
     <w:p>
       <w:pPr>
-        <w:pStyle w:val="10"/>
+        <w:pStyle w:val="Heading1"/>
         <w:numPr>
           <w:ilvl w:val="0"/>
           <w:numId w:val="0"/>
@@ -3675,7 +3675,7 @@
     </w:p>
     <w:p>
       <w:pPr>
-        <w:pStyle w:val="10"/>
+        <w:pStyle w:val="Heading1"/>
       </w:pPr>
       <w:bookmarkStart w:id="4" w:name="_Toc226770181"/>
       <w:r>
@@ -3686,7 +3686,7 @@
     </w:p>
     <w:p>
       <w:pPr>
-        <w:pStyle w:val="2"/>
+        <w:pStyle w:val="Heading2"/>
         <w:rPr>
           <w:rFonts w:eastAsia="Times New Roman"/>
         </w:rPr>
@@ -3701,7 +3701,7 @@
     </w:p>
     <w:p>
       <w:pPr>
-        <w:pStyle w:val="a3"/>
+        <w:pStyle w:val="a2"/>
       </w:pPr>
       <w:r>
         <w:t>К работе на персональном компьютере допускаются лица, прошедшие обучение безопасным методам труда, вводный инструктаж, первичный инструктаж на рабочем месте.</w:t>
@@ -3709,7 +3709,7 @@
     </w:p>
     <w:p>
       <w:pPr>
-        <w:pStyle w:val="a3"/>
+        <w:pStyle w:val="a2"/>
       </w:pPr>
       <w:r>
         <w:t>При эксплуатации персонального компьютера на работника могут оказывать действие следующие опасные и вредные производственные факторы:</w:t>
@@ -3749,7 +3749,7 @@
     </w:p>
     <w:p>
       <w:pPr>
-        <w:pStyle w:val="a3"/>
+        <w:pStyle w:val="a2"/>
       </w:pPr>
       <w:r>
         <w:t>Работник обязан выполнять только ту работу, которая определена его должностной инструкцией.</w:t>
@@ -3757,7 +3757,7 @@
     </w:p>
     <w:p>
       <w:pPr>
-        <w:pStyle w:val="2"/>
+        <w:pStyle w:val="Heading2"/>
         <w:rPr>
           <w:rFonts w:eastAsia="Times New Roman"/>
         </w:rPr>
@@ -3775,7 +3775,7 @@
     </w:p>
     <w:p>
       <w:pPr>
-        <w:pStyle w:val="a3"/>
+        <w:pStyle w:val="a2"/>
       </w:pPr>
       <w:r>
         <w:t>Перед началом работы пользователь обязан:</w:t>
@@ -3847,7 +3847,7 @@
     </w:p>
     <w:p>
       <w:pPr>
-        <w:pStyle w:val="2"/>
+        <w:pStyle w:val="Heading2"/>
         <w:rPr>
           <w:rFonts w:eastAsia="Times New Roman"/>
         </w:rPr>
@@ -3865,7 +3865,7 @@
     </w:p>
     <w:p>
       <w:pPr>
-        <w:pStyle w:val="a3"/>
+        <w:pStyle w:val="a2"/>
       </w:pPr>
       <w:r>
         <w:t>По окончании работы компьютера необходимо</w:t>
@@ -3909,7 +3909,7 @@
     </w:p>
     <w:p>
       <w:pPr>
-        <w:pStyle w:val="10"/>
+        <w:pStyle w:val="Heading1"/>
         <w:rPr>
           <w:lang w:val="en-US"/>
         </w:rPr>
@@ -3964,7 +3964,7 @@
     </w:p>
     <w:p>
       <w:pPr>
-        <w:pStyle w:val="2"/>
+        <w:pStyle w:val="Heading2"/>
       </w:pPr>
       <w:bookmarkStart w:id="13" w:name="_Toc226770186"/>
       <w:r>
@@ -3974,7 +3974,7 @@
     </w:p>
     <w:p>
       <w:pPr>
-        <w:pStyle w:val="a3"/>
+        <w:pStyle w:val="a2"/>
       </w:pPr>
       <w:r>
         <w:t>Требуется разработать ИС для</w:t>
@@ -3991,7 +3991,7 @@
     </w:p>
     <w:p>
       <w:pPr>
-        <w:pStyle w:val="a3"/>
+        <w:pStyle w:val="a2"/>
       </w:pPr>
       <w:r>
         <w:t>Область применения ИС охватывает</w:t>
@@ -4014,7 +4014,7 @@
     </w:p>
     <w:p>
       <w:pPr>
-        <w:pStyle w:val="a3"/>
+        <w:pStyle w:val="a2"/>
       </w:pPr>
       <w:r>
         <w:t>Основное назначение внедрения разрабатываемой ИС</w:t>
@@ -4070,7 +4070,7 @@
     </w:p>
     <w:p>
       <w:pPr>
-        <w:pStyle w:val="a3"/>
+        <w:pStyle w:val="a2"/>
       </w:pPr>
       <w:r>
         <w:t>Система предназначена для</w:t>
@@ -4087,7 +4087,7 @@
     </w:p>
     <w:p>
       <w:pPr>
-        <w:pStyle w:val="2"/>
+        <w:pStyle w:val="Heading2"/>
       </w:pPr>
       <w:bookmarkStart w:id="14" w:name="_Toc226770187"/>
       <w:r>
@@ -4097,7 +4097,7 @@
     </w:p>
     <w:p>
       <w:pPr>
-        <w:pStyle w:val="a3"/>
+        <w:pStyle w:val="a2"/>
       </w:pPr>
       <w:r>
         <w:t xml:space="preserve">Согласно требованиям необходимо создать ИС, </w:t>
@@ -4111,46 +4111,78 @@
     </w:p>
     <w:p>
       <w:pPr>
-        <w:pStyle w:val="a3"/>
+        <w:pStyle w:val="a2"/>
       </w:pPr>
       <w:r>
         <w:t>Для разработки была выбрана веб-платформа</w:t>
       </w:r>
       <w:r>
-        <w:t>, так как решение с веб-интерфейсом</w:t>
+        <w:t>, так как решение с веб-интерфейсом обеспечива</w:t>
+      </w:r>
+      <w:r>
+        <w:t>ет</w:t>
       </w:r>
       <w:r>
         <w:t xml:space="preserve"> </w:t>
       </w:r>
       <w:r>
-        <w:t>[3] обеспечива</w:t>
-      </w:r>
-      <w:r>
-        <w:t>ет</w:t>
+        <w:t>доступность с большинства устройств</w:t>
+      </w:r>
+      <w:r>
+        <w:t>,</w:t>
+      </w:r>
+      <w:r>
+        <w:t xml:space="preserve"> имеющи</w:t>
+      </w:r>
+      <w:r>
+        <w:t>х</w:t>
+      </w:r>
+      <w:r>
+        <w:t xml:space="preserve"> веб-браузеры</w:t>
       </w:r>
       <w:r>
         <w:t xml:space="preserve"> </w:t>
       </w:r>
       <w:r>
-        <w:t>доступность с большинства устройств</w:t>
-      </w:r>
-      <w:r>
-        <w:t>,</w:t>
-      </w:r>
-      <w:r>
-        <w:t xml:space="preserve"> имеющи</w:t>
-      </w:r>
-      <w:r>
-        <w:t>х</w:t>
-      </w:r>
-      <w:r>
-        <w:t xml:space="preserve"> веб-браузеры</w:t>
+        <w:t>и выход в интернет</w:t>
+      </w:r>
+      <w:r>
+        <w:t>.</w:t>
+      </w:r>
+    </w:p>
+    <w:p>
+      <w:pPr>
+        <w:pStyle w:val="a2"/>
+      </w:pPr>
+      <w:r>
+        <w:t>В качестве основных инструментов разработки выбран</w:t>
       </w:r>
       <w:r>
         <w:t xml:space="preserve"> </w:t>
       </w:r>
       <w:r>
-        <w:t>и выход в интернет</w:t>
+        <w:t>язык</w:t>
+      </w:r>
+      <w:r>
+        <w:t xml:space="preserve"> </w:t>
+      </w:r>
+      <w:r>
+        <w:t>программирования C#</w:t>
+      </w:r>
+      <w:r>
+        <w:t xml:space="preserve"> и</w:t>
+      </w:r>
+      <w:r>
+        <w:t xml:space="preserve"> набор инструментов</w:t>
+      </w:r>
+      <w:r>
+        <w:t xml:space="preserve"> </w:t>
+      </w:r>
+      <w:r>
+        <w:t>ASP.NET Core</w:t>
+      </w:r>
+      <w:r>
+        <w:t xml:space="preserve"> [2]</w:t>
       </w:r>
       <w:r>
         <w:t>.</w:t>
@@ -4158,39 +4190,7 @@
     </w:p>
     <w:p>
       <w:pPr>
-        <w:pStyle w:val="a3"/>
-      </w:pPr>
-      <w:r>
-        <w:t>В качестве основных инструментов разработки выбран</w:t>
-      </w:r>
-      <w:r>
-        <w:t xml:space="preserve"> </w:t>
-      </w:r>
-      <w:r>
-        <w:t>язык</w:t>
-      </w:r>
-      <w:r>
-        <w:t xml:space="preserve"> </w:t>
-      </w:r>
-      <w:r>
-        <w:t>программирования C#</w:t>
-      </w:r>
-      <w:r>
-        <w:t xml:space="preserve"> и</w:t>
-      </w:r>
-      <w:r>
-        <w:t xml:space="preserve"> набор инструментов</w:t>
-      </w:r>
-      <w:r>
-        <w:t xml:space="preserve"> </w:t>
-      </w:r>
-      <w:r>
-        <w:t>ASP.NET Core.</w:t>
-      </w:r>
-    </w:p>
-    <w:p>
-      <w:pPr>
-        <w:pStyle w:val="a3"/>
+        <w:pStyle w:val="a2"/>
       </w:pPr>
       <w:r>
         <w:t xml:space="preserve">Для разработки приложения будет использоваться IDE Visual Studio 2022, обладающая следующими преимуществами: </w:t>
@@ -4198,7 +4198,7 @@
     </w:p>
     <w:p>
       <w:pPr>
-        <w:pStyle w:val="a3"/>
+        <w:pStyle w:val="a2"/>
       </w:pPr>
       <w:r>
         <w:t>- встроенные средства отладки и тестирования кода;</w:t>
@@ -4206,7 +4206,7 @@
     </w:p>
     <w:p>
       <w:pPr>
-        <w:pStyle w:val="a3"/>
+        <w:pStyle w:val="a2"/>
       </w:pPr>
       <w:r>
         <w:t>- автогенерация кода;</w:t>
@@ -4214,7 +4214,7 @@
     </w:p>
     <w:p>
       <w:pPr>
-        <w:pStyle w:val="a3"/>
+        <w:pStyle w:val="a2"/>
       </w:pPr>
       <w:r>
         <w:lastRenderedPageBreak/>
@@ -4223,7 +4223,7 @@
     </w:p>
     <w:p>
       <w:pPr>
-        <w:pStyle w:val="a3"/>
+        <w:pStyle w:val="a2"/>
       </w:pPr>
       <w:r>
         <w:t>- встроенные средства рефакторинга кода;</w:t>
@@ -4231,7 +4231,7 @@
     </w:p>
     <w:p>
       <w:pPr>
-        <w:pStyle w:val="a3"/>
+        <w:pStyle w:val="a2"/>
       </w:pPr>
       <w:r>
         <w:t>- встроенный мониторинг системных ресурсов;</w:t>
@@ -4239,7 +4239,7 @@
     </w:p>
     <w:p>
       <w:pPr>
-        <w:pStyle w:val="a3"/>
+        <w:pStyle w:val="a2"/>
       </w:pPr>
       <w:r>
         <w:t>- интеграция с системами управления версиями.</w:t>
@@ -4247,7 +4247,7 @@
     </w:p>
     <w:p>
       <w:pPr>
-        <w:pStyle w:val="a3"/>
+        <w:pStyle w:val="a2"/>
       </w:pPr>
       <w:r>
         <w:t>К целевому устройству предъявляются следующие минимальныесистемные требования:</w:t>
@@ -4255,7 +4255,7 @@
     </w:p>
     <w:p>
       <w:pPr>
-        <w:pStyle w:val="a3"/>
+        <w:pStyle w:val="a2"/>
       </w:pPr>
       <w:r>
         <w:t>- современный веб-браузер</w:t>
@@ -4266,10 +4266,7 @@
     </w:p>
     <w:p>
       <w:pPr>
-        <w:pStyle w:val="a3"/>
-        <w:rPr>
-          <w:lang w:val="en-US"/>
-        </w:rPr>
+        <w:pStyle w:val="a2"/>
       </w:pPr>
       <w:r>
         <w:t xml:space="preserve">- </w:t>
@@ -4278,15 +4275,12 @@
         <w:t>выход в интернет</w:t>
       </w:r>
       <w:r>
-        <w:rPr>
-          <w:lang w:val="en-US"/>
-        </w:rPr>
         <w:t>.</w:t>
       </w:r>
     </w:p>
     <w:p>
       <w:pPr>
-        <w:pStyle w:val="2"/>
+        <w:pStyle w:val="Heading2"/>
       </w:pPr>
       <w:bookmarkStart w:id="15" w:name="_Toc226770188"/>
       <w:r>
@@ -4296,7 +4290,7 @@
     </w:p>
     <w:p>
       <w:pPr>
-        <w:pStyle w:val="a3"/>
+        <w:pStyle w:val="a2"/>
       </w:pPr>
       <w:r>
         <w:t>Этап проектирования программного обеспечения представляет собой ключевую стадию разработки, в ходе которой закладываются структурные основы системы, обосновывается выбор программных средств и определяются способы реализации функциональных требований.</w:t>
@@ -4304,7 +4298,7 @@
     </w:p>
     <w:p>
       <w:pPr>
-        <w:pStyle w:val="a3"/>
+        <w:pStyle w:val="a2"/>
       </w:pPr>
       <w:r>
         <w:t xml:space="preserve">При разработке </w:t>
@@ -4321,7 +4315,7 @@
     </w:p>
     <w:p>
       <w:pPr>
-        <w:pStyle w:val="a3"/>
+        <w:pStyle w:val="a2"/>
       </w:pPr>
       <w:r>
         <w:t xml:space="preserve">В качестве СУБД требуется использовать систему </w:t>
@@ -4333,6 +4327,9 @@
         <w:t>MySQL</w:t>
       </w:r>
       <w:r>
+        <w:t xml:space="preserve"> [3]</w:t>
+      </w:r>
+      <w:r>
         <w:t>, так</w:t>
       </w:r>
       <w:r>
@@ -4417,7 +4414,7 @@
     </w:p>
     <w:p>
       <w:pPr>
-        <w:pStyle w:val="a3"/>
+        <w:pStyle w:val="a2"/>
       </w:pPr>
       <w:r>
         <w:t xml:space="preserve">Структура БД должна быть разработана с учетом специфики предметной области и возможности дальнейшего масштабирования. </w:t>
@@ -4425,7 +4422,7 @@
     </w:p>
     <w:p>
       <w:pPr>
-        <w:pStyle w:val="a3"/>
+        <w:pStyle w:val="a2"/>
       </w:pPr>
       <w:r>
         <w:t xml:space="preserve">Разработанная физическая модель БД для системы </w:t>
@@ -4442,7 +4439,7 @@
     </w:p>
     <w:p>
       <w:pPr>
-        <w:pStyle w:val="afd"/>
+        <w:pStyle w:val="a9"/>
       </w:pPr>
       <w:r>
         <w:rPr>
@@ -4494,7 +4491,7 @@
     </w:p>
     <w:p>
       <w:pPr>
-        <w:pStyle w:val="afd"/>
+        <w:pStyle w:val="a9"/>
       </w:pPr>
       <w:r>
         <w:t>Рисунок 1 – Физическая модель БД</w:t>
@@ -4502,181 +4499,181 @@
     </w:p>
     <w:p>
       <w:pPr>
-        <w:pStyle w:val="a3"/>
-        <w:rPr>
-          <w:rStyle w:val="af0"/>
-        </w:rPr>
-      </w:pPr>
-      <w:r>
-        <w:rPr>
-          <w:rStyle w:val="af0"/>
+        <w:pStyle w:val="a2"/>
+        <w:rPr>
+          <w:rStyle w:val="a3"/>
+        </w:rPr>
+      </w:pPr>
+      <w:r>
+        <w:rPr>
+          <w:rStyle w:val="a3"/>
         </w:rPr>
         <w:t xml:space="preserve">В ходе проектирования пользовательского интерфейса с помощью сервиса </w:t>
       </w:r>
       <w:r>
         <w:rPr>
-          <w:rStyle w:val="af0"/>
+          <w:rStyle w:val="a3"/>
           <w:lang w:val="en-US"/>
         </w:rPr>
         <w:t>Figma</w:t>
       </w:r>
       <w:r>
         <w:rPr>
-          <w:rStyle w:val="af0"/>
+          <w:rStyle w:val="a3"/>
         </w:rPr>
         <w:t xml:space="preserve"> разработан каркас высокой точности wireframe для </w:t>
       </w:r>
       <w:r>
         <w:rPr>
-          <w:rStyle w:val="af0"/>
+          <w:rStyle w:val="a3"/>
         </w:rPr>
         <w:t>приложения</w:t>
       </w:r>
       <w:r>
         <w:rPr>
-          <w:rStyle w:val="af0"/>
+          <w:rStyle w:val="a3"/>
         </w:rPr>
         <w:t xml:space="preserve"> [4]</w:t>
       </w:r>
       <w:r>
         <w:rPr>
-          <w:rStyle w:val="af0"/>
+          <w:rStyle w:val="a3"/>
         </w:rPr>
         <w:t>.</w:t>
       </w:r>
     </w:p>
     <w:p>
       <w:pPr>
-        <w:pStyle w:val="a3"/>
-        <w:rPr>
-          <w:rStyle w:val="af0"/>
-        </w:rPr>
-      </w:pPr>
-      <w:r>
-        <w:rPr>
-          <w:rStyle w:val="af0"/>
+        <w:pStyle w:val="a2"/>
+        <w:rPr>
+          <w:rStyle w:val="a3"/>
+        </w:rPr>
+      </w:pPr>
+      <w:r>
+        <w:rPr>
+          <w:rStyle w:val="a3"/>
         </w:rPr>
         <w:t xml:space="preserve">Схема взаимодействия с главным экраном управления складом выполнена в соответствии с рисунком 2. На экране присутствуют блок </w:t>
       </w:r>
       <w:r>
         <w:rPr>
-          <w:rStyle w:val="af0"/>
+          <w:rStyle w:val="a3"/>
         </w:rPr>
         <w:t>навигации, содержащий кнопку для выхода из приложения и кнопки переключения между вкладками «Туры», «Отели» и «Заявки», кнопка для создания нового тура</w:t>
       </w:r>
       <w:r>
         <w:rPr>
-          <w:rStyle w:val="af0"/>
+          <w:rStyle w:val="a3"/>
         </w:rPr>
         <w:t xml:space="preserve"> </w:t>
       </w:r>
       <w:r>
         <w:rPr>
-          <w:rStyle w:val="af0"/>
+          <w:rStyle w:val="a3"/>
         </w:rPr>
         <w:t xml:space="preserve">таблица </w:t>
       </w:r>
       <w:r>
         <w:rPr>
-          <w:rStyle w:val="af0"/>
+          <w:rStyle w:val="a3"/>
         </w:rPr>
         <w:t>туров</w:t>
       </w:r>
       <w:r>
         <w:rPr>
-          <w:rStyle w:val="af0"/>
+          <w:rStyle w:val="a3"/>
         </w:rPr>
         <w:t xml:space="preserve"> с</w:t>
       </w:r>
       <w:r>
         <w:rPr>
-          <w:rStyle w:val="af0"/>
+          <w:rStyle w:val="a3"/>
         </w:rPr>
         <w:t xml:space="preserve"> ко</w:t>
       </w:r>
       <w:r>
         <w:rPr>
-          <w:rStyle w:val="af0"/>
+          <w:rStyle w:val="a3"/>
         </w:rPr>
         <w:t xml:space="preserve">лонками </w:t>
       </w:r>
       <w:r>
         <w:rPr>
-          <w:rStyle w:val="af0"/>
+          <w:rStyle w:val="a3"/>
         </w:rPr>
         <w:t>«Название»</w:t>
       </w:r>
       <w:r>
         <w:rPr>
-          <w:rStyle w:val="af0"/>
+          <w:rStyle w:val="a3"/>
         </w:rPr>
         <w:t xml:space="preserve">, </w:t>
       </w:r>
       <w:r>
         <w:rPr>
-          <w:rStyle w:val="af0"/>
+          <w:rStyle w:val="a3"/>
         </w:rPr>
         <w:t>«Даты»</w:t>
       </w:r>
       <w:r>
         <w:rPr>
-          <w:rStyle w:val="af0"/>
+          <w:rStyle w:val="a3"/>
         </w:rPr>
         <w:t xml:space="preserve">, </w:t>
       </w:r>
       <w:r>
         <w:rPr>
-          <w:rStyle w:val="af0"/>
+          <w:rStyle w:val="a3"/>
         </w:rPr>
         <w:t>«Цена»,</w:t>
       </w:r>
       <w:r>
         <w:rPr>
-          <w:rStyle w:val="af0"/>
+          <w:rStyle w:val="a3"/>
         </w:rPr>
         <w:t xml:space="preserve"> </w:t>
       </w:r>
       <w:r>
         <w:rPr>
-          <w:rStyle w:val="af0"/>
+          <w:rStyle w:val="a3"/>
         </w:rPr>
         <w:t>«Кол-во человек»</w:t>
       </w:r>
       <w:r>
         <w:rPr>
-          <w:rStyle w:val="af0"/>
+          <w:rStyle w:val="a3"/>
         </w:rPr>
         <w:t xml:space="preserve"> и </w:t>
       </w:r>
       <w:r>
         <w:rPr>
-          <w:rStyle w:val="af0"/>
+          <w:rStyle w:val="a3"/>
         </w:rPr>
         <w:t>«Отель»</w:t>
       </w:r>
       <w:r>
         <w:rPr>
-          <w:rStyle w:val="af0"/>
+          <w:rStyle w:val="a3"/>
         </w:rPr>
         <w:t xml:space="preserve">. </w:t>
       </w:r>
     </w:p>
     <w:p>
       <w:pPr>
-        <w:pStyle w:val="a3"/>
-        <w:rPr>
-          <w:rStyle w:val="af0"/>
-        </w:rPr>
-      </w:pPr>
-      <w:r>
-        <w:rPr>
-          <w:rStyle w:val="af0"/>
+        <w:pStyle w:val="a2"/>
+        <w:rPr>
+          <w:rStyle w:val="a3"/>
+        </w:rPr>
+      </w:pPr>
+      <w:r>
+        <w:rPr>
+          <w:rStyle w:val="a3"/>
         </w:rPr>
         <w:t xml:space="preserve">В ходе проектирования поставлена задача спроектировать интерфейс с интуитивно понятной навигацией. Это необходимо для удовлетворения </w:t>
       </w:r>
       <w:r>
         <w:rPr>
-          <w:rStyle w:val="af0"/>
+          <w:rStyle w:val="a3"/>
         </w:rPr>
         <w:lastRenderedPageBreak/>
         <w:t>потребностей пользователей в удобном, быстром и эффективном взаимодействии с системой при контроле товарных остатков.</w:t>
@@ -4684,15 +4681,15 @@
     </w:p>
     <w:p>
       <w:pPr>
-        <w:pStyle w:val="a3"/>
-        <w:rPr>
-          <w:rStyle w:val="af0"/>
-        </w:rPr>
-      </w:pPr>
-    </w:p>
-    <w:p>
-      <w:pPr>
-        <w:pStyle w:val="a3"/>
+        <w:pStyle w:val="a2"/>
+        <w:rPr>
+          <w:rStyle w:val="a3"/>
+        </w:rPr>
+      </w:pPr>
+    </w:p>
+    <w:p>
+      <w:pPr>
+        <w:pStyle w:val="a2"/>
         <w:jc w:val="center"/>
         <w:rPr>
           <w:rFonts w:eastAsia="Times New Roman" w:cs="Times New Roman"/>
@@ -4762,7 +4759,7 @@
     </w:p>
     <w:p>
       <w:pPr>
-        <w:pStyle w:val="afd"/>
+        <w:pStyle w:val="a9"/>
       </w:pPr>
       <w:r>
         <w:t xml:space="preserve">Рисунок 2 – </w:t>
@@ -4779,7 +4776,7 @@
     </w:p>
     <w:p>
       <w:pPr>
-        <w:pStyle w:val="2"/>
+        <w:pStyle w:val="Heading2"/>
       </w:pPr>
       <w:bookmarkStart w:id="16" w:name="_Toc226770189"/>
       <w:r>
@@ -4801,7 +4798,13 @@
       </w:r>
       <w:r>
         <w:lastRenderedPageBreak/>
-        <w:t xml:space="preserve">интегрированной среде разработки Visual Studio 2022. Программный продукт </w:t>
+        <w:t>интегрированной среде разработки Visual Studio 2022</w:t>
+      </w:r>
+      <w:r>
+        <w:t xml:space="preserve"> [5]</w:t>
+      </w:r>
+      <w:r>
+        <w:t xml:space="preserve">. Программный продукт </w:t>
       </w:r>
       <w:r>
         <w:t>использует</w:t>
@@ -4855,21 +4858,25 @@
       <w:r>
         <w:t>«</w:t>
       </w:r>
+      <w:proofErr w:type="spellStart"/>
       <w:r>
         <w:rPr>
           <w:lang w:val="en-US"/>
         </w:rPr>
         <w:t>MySql</w:t>
       </w:r>
+      <w:proofErr w:type="spellEnd"/>
       <w:r>
         <w:t>.</w:t>
       </w:r>
+      <w:proofErr w:type="spellStart"/>
       <w:r>
         <w:rPr>
           <w:lang w:val="en-US"/>
         </w:rPr>
         <w:t>EntityFrameworkCore</w:t>
       </w:r>
+      <w:proofErr w:type="spellEnd"/>
       <w:r>
         <w:t xml:space="preserve">» – </w:t>
       </w:r>
@@ -4905,7 +4912,7 @@
     </w:p>
     <w:p>
       <w:pPr>
-        <w:pStyle w:val="2"/>
+        <w:pStyle w:val="Heading2"/>
       </w:pPr>
       <w:bookmarkStart w:id="17" w:name="_Toc226770190"/>
       <w:r>
@@ -4927,20 +4934,15 @@
     </w:p>
     <w:p>
       <w:pPr>
-        <w:pStyle w:val="a3"/>
-      </w:pPr>
-      <w:r>
-        <w:t>В ходе реализации програм</w:t>
-      </w:r>
-      <w:bookmarkStart w:id="18" w:name="_GoBack"/>
-      <w:bookmarkEnd w:id="18"/>
-      <w:r>
-        <w:t>много продукта контроль версий осуществлялся с помощью системы Git. Организация рабочего процесса базировалась на модели ветвления «Git Flow», которая предполагает изоляцию новых функций в отдельных ветках и поддержку стабильного состояния основных веток проекта.</w:t>
-      </w:r>
-    </w:p>
-    <w:p>
-      <w:pPr>
-        <w:pStyle w:val="a3"/>
+        <w:pStyle w:val="a2"/>
+      </w:pPr>
+      <w:r>
+        <w:t>В ходе реализации программного продукта контроль версий осуществлялся с помощью системы Git. Организация рабочего процесса базировалась на модели ветвления «Git Flow», которая предполагает изоляцию новых функций в отдельных ветках и поддержку стабильного состояния основных веток проекта.</w:t>
+      </w:r>
+    </w:p>
+    <w:p>
+      <w:pPr>
+        <w:pStyle w:val="a2"/>
       </w:pPr>
       <w:r>
         <w:t>Для взаимодействия с локальным репозиторием применялись как возможности командной строки через терминал «Git Bash», так и встроенный графический интерфейс среды разработки Visual Studio. Размещение исходного кода в облачном хранилище и координация изменений между рабочими окружениями обеспечивались инструментами сервиса GitHub.</w:t>
@@ -4948,7 +4950,7 @@
     </w:p>
     <w:p>
       <w:pPr>
-        <w:pStyle w:val="a3"/>
+        <w:pStyle w:val="a2"/>
       </w:pPr>
       <w:r>
         <w:t xml:space="preserve">Фрагмент графа коммитов в репозитории представлен на рисунке </w:t>
@@ -4962,22 +4964,22 @@
     </w:p>
     <w:p>
       <w:pPr>
-        <w:pStyle w:val="a3"/>
-      </w:pPr>
-    </w:p>
-    <w:p>
-      <w:pPr>
-        <w:pStyle w:val="a3"/>
-      </w:pPr>
-    </w:p>
-    <w:p>
-      <w:pPr>
-        <w:pStyle w:val="a3"/>
-      </w:pPr>
-    </w:p>
-    <w:p>
-      <w:pPr>
-        <w:pStyle w:val="afd"/>
+        <w:pStyle w:val="a2"/>
+      </w:pPr>
+    </w:p>
+    <w:p>
+      <w:pPr>
+        <w:pStyle w:val="a2"/>
+      </w:pPr>
+    </w:p>
+    <w:p>
+      <w:pPr>
+        <w:pStyle w:val="a2"/>
+      </w:pPr>
+    </w:p>
+    <w:p>
+      <w:pPr>
+        <w:pStyle w:val="a9"/>
       </w:pPr>
       <w:r>
         <w:rPr>
@@ -5029,7 +5031,7 @@
     </w:p>
     <w:p>
       <w:pPr>
-        <w:pStyle w:val="afd"/>
+        <w:pStyle w:val="a9"/>
       </w:pPr>
       <w:r>
         <w:t xml:space="preserve">Рисунок 3 – </w:t>
@@ -5043,17 +5045,17 @@
     </w:p>
     <w:p>
       <w:pPr>
-        <w:pStyle w:val="2"/>
-      </w:pPr>
-      <w:bookmarkStart w:id="19" w:name="_Toc226770191"/>
+        <w:pStyle w:val="Heading2"/>
+      </w:pPr>
+      <w:bookmarkStart w:id="18" w:name="_Toc226770191"/>
       <w:r>
         <w:t>Отладка и тестирование программных модулей</w:t>
       </w:r>
-      <w:bookmarkEnd w:id="19"/>
-    </w:p>
-    <w:p>
-      <w:pPr>
-        <w:pStyle w:val="a3"/>
+      <w:bookmarkEnd w:id="18"/>
+    </w:p>
+    <w:p>
+      <w:pPr>
+        <w:pStyle w:val="a2"/>
       </w:pPr>
       <w:r>
         <w:t>Интерфейс IDE Visual Studio 20</w:t>
@@ -5082,21 +5084,21 @@
     </w:p>
     <w:p>
       <w:pPr>
-        <w:pStyle w:val="a3"/>
-      </w:pPr>
-    </w:p>
-    <w:p>
-      <w:pPr>
-        <w:pStyle w:val="14"/>
+        <w:pStyle w:val="a2"/>
+      </w:pPr>
+    </w:p>
+    <w:p>
+      <w:pPr>
+        <w:pStyle w:val="11"/>
       </w:pPr>
       <w:r>
         <w:rPr>
           <w:noProof/>
         </w:rPr>
         <w:drawing>
-          <wp:inline distT="0" distB="0" distL="0" distR="0" wp14:anchorId="203C335D" wp14:editId="2492D5A8">
-            <wp:extent cx="5356799" cy="3135085"/>
-            <wp:effectExtent l="0" t="0" r="0" b="8255"/>
+          <wp:inline distT="0" distB="0" distL="0" distR="0" wp14:anchorId="203C335D" wp14:editId="5ACD1BF6">
+            <wp:extent cx="5210175" cy="3049271"/>
+            <wp:effectExtent l="0" t="0" r="0" b="0"/>
             <wp:docPr id="4" name="Рисунок 4"/>
             <wp:cNvGraphicFramePr>
               <a:graphicFrameLocks xmlns:a="http://schemas.openxmlformats.org/drawingml/2006/main" noChangeAspect="1"/>
@@ -5125,7 +5127,7 @@
                   <pic:spPr bwMode="auto">
                     <a:xfrm>
                       <a:off x="0" y="0"/>
-                      <a:ext cx="5371278" cy="3143559"/>
+                      <a:ext cx="5258035" cy="3077281"/>
                     </a:xfrm>
                     <a:prstGeom prst="rect">
                       <a:avLst/>
@@ -5141,7 +5143,10 @@
     </w:p>
     <w:p>
       <w:pPr>
-        <w:pStyle w:val="afd"/>
+        <w:pStyle w:val="a9"/>
+        <w:rPr>
+          <w:lang w:val="en-US"/>
+        </w:rPr>
       </w:pPr>
       <w:r>
         <w:t xml:space="preserve">Рисунок 4 – «Visual Studio </w:t>
@@ -5161,7 +5166,151 @@
     </w:p>
     <w:p>
       <w:pPr>
-        <w:pStyle w:val="a3"/>
+        <w:pStyle w:val="a2"/>
+      </w:pPr>
+      <w:r>
+        <w:t xml:space="preserve">Для проверки корректности работы приложения создан класс для тестирования контроллера </w:t>
+      </w:r>
+      <w:proofErr w:type="spellStart"/>
+      <w:r>
+        <w:rPr>
+          <w:lang w:val="en-US"/>
+        </w:rPr>
+        <w:t>ToursController</w:t>
+      </w:r>
+      <w:proofErr w:type="spellEnd"/>
+      <w:r>
+        <w:t xml:space="preserve"> [1]</w:t>
+      </w:r>
+      <w:r>
+        <w:t>.</w:t>
+      </w:r>
+      <w:r>
+        <w:t xml:space="preserve"> Код </w:t>
+      </w:r>
+      <w:r>
+        <w:t xml:space="preserve"> метода</w:t>
+      </w:r>
+      <w:r>
+        <w:t>1</w:t>
+      </w:r>
+      <w:r>
+        <w:t xml:space="preserve"> для проверки </w:t>
+      </w:r>
+      <w:r>
+        <w:lastRenderedPageBreak/>
+        <w:t>правильности отображения списка доступных туров представлен листингом 1</w:t>
+      </w:r>
+      <w:r>
+        <w:t>.</w:t>
+      </w:r>
+    </w:p>
+    <w:p>
+      <w:pPr>
+        <w:pStyle w:val="a2"/>
+        <w:ind w:firstLine="0"/>
+      </w:pPr>
+    </w:p>
+    <w:p>
+      <w:pPr>
+        <w:pStyle w:val="a2"/>
+        <w:ind w:firstLine="0"/>
+      </w:pPr>
+      <w:r>
+        <w:t>Листинг</w:t>
+      </w:r>
+      <w:r>
+        <w:rPr>
+          <w:lang w:val="en-US"/>
+        </w:rPr>
+        <w:t xml:space="preserve"> 1 – </w:t>
+      </w:r>
+      <w:r>
+        <w:t>Код</w:t>
+      </w:r>
+      <w:r>
+        <w:rPr>
+          <w:lang w:val="en-US"/>
+        </w:rPr>
+        <w:t xml:space="preserve"> </w:t>
+      </w:r>
+      <w:r>
+        <w:t>метода</w:t>
+      </w:r>
+      <w:r>
+        <w:rPr>
+          <w:lang w:val="en-US"/>
+        </w:rPr>
+        <w:t xml:space="preserve"> </w:t>
+      </w:r>
+      <w:proofErr w:type="spellStart"/>
+      <w:r>
+        <w:rPr>
+          <w:lang w:val="en-US"/>
+        </w:rPr>
+        <w:t>Index_ReturnsViewWithTours</w:t>
+      </w:r>
+      <w:proofErr w:type="spellEnd"/>
+    </w:p>
+    <w:p>
+      <w:pPr>
+        <w:pStyle w:val="ac"/>
+      </w:pPr>
+      <w:r>
+        <w:rPr>
+          <w:lang w:val="en-US"/>
+        </w:rPr>
+        <w:t>[Fact]</w:t>
+      </w:r>
+    </w:p>
+    <w:p>
+      <w:pPr>
+        <w:pStyle w:val="ac"/>
+        <w:rPr>
+          <w:lang w:val="en-US"/>
+        </w:rPr>
+      </w:pPr>
+      <w:r>
+        <w:rPr>
+          <w:lang w:val="en-US"/>
+        </w:rPr>
+        <w:t xml:space="preserve">public async Task </w:t>
+      </w:r>
+      <w:proofErr w:type="spellStart"/>
+      <w:r>
+        <w:rPr>
+          <w:lang w:val="en-US"/>
+        </w:rPr>
+        <w:t>Index_</w:t>
+      </w:r>
+      <w:proofErr w:type="gramStart"/>
+      <w:r>
+        <w:rPr>
+          <w:lang w:val="en-US"/>
+        </w:rPr>
+        <w:t>ReturnsViewWithTours</w:t>
+      </w:r>
+      <w:proofErr w:type="spellEnd"/>
+      <w:r>
+        <w:rPr>
+          <w:lang w:val="en-US"/>
+        </w:rPr>
+        <w:t>(</w:t>
+      </w:r>
+      <w:proofErr w:type="gramEnd"/>
+      <w:r>
+        <w:rPr>
+          <w:lang w:val="en-US"/>
+        </w:rPr>
+        <w:t>)</w:t>
+      </w:r>
+    </w:p>
+    <w:p>
+      <w:pPr>
+        <w:pStyle w:val="ac"/>
+        <w:rPr>
+          <w:lang w:val="en-US"/>
+        </w:rPr>
       </w:pPr>
       <w:r>
         <w:rPr>
@@ -5169,9 +5318,505 @@
         </w:rPr>
         <w:t>{</w:t>
       </w:r>
-      <w:r>
-        <w:t>ТЕСТИРОВАНИЕ</w:t>
-      </w:r>
+    </w:p>
+    <w:p>
+      <w:pPr>
+        <w:pStyle w:val="ac"/>
+        <w:rPr>
+          <w:lang w:val="en-US"/>
+        </w:rPr>
+      </w:pPr>
+      <w:r>
+        <w:rPr>
+          <w:lang w:val="en-US"/>
+        </w:rPr>
+        <w:t xml:space="preserve">    using var context = </w:t>
+      </w:r>
+      <w:proofErr w:type="spellStart"/>
+      <w:proofErr w:type="gramStart"/>
+      <w:r>
+        <w:rPr>
+          <w:lang w:val="en-US"/>
+        </w:rPr>
+        <w:t>GetDbContext</w:t>
+      </w:r>
+      <w:proofErr w:type="spellEnd"/>
+      <w:r>
+        <w:rPr>
+          <w:lang w:val="en-US"/>
+        </w:rPr>
+        <w:t>();</w:t>
+      </w:r>
+      <w:proofErr w:type="gramEnd"/>
+    </w:p>
+    <w:p>
+      <w:pPr>
+        <w:pStyle w:val="ac"/>
+        <w:rPr>
+          <w:lang w:val="en-US"/>
+        </w:rPr>
+      </w:pPr>
+      <w:r>
+        <w:rPr>
+          <w:lang w:val="en-US"/>
+        </w:rPr>
+        <w:t xml:space="preserve">    </w:t>
+      </w:r>
+      <w:proofErr w:type="spellStart"/>
+      <w:proofErr w:type="gramStart"/>
+      <w:r>
+        <w:rPr>
+          <w:lang w:val="en-US"/>
+        </w:rPr>
+        <w:t>context.Tours.Add</w:t>
+      </w:r>
+      <w:proofErr w:type="spellEnd"/>
+      <w:proofErr w:type="gramEnd"/>
+      <w:r>
+        <w:rPr>
+          <w:lang w:val="en-US"/>
+        </w:rPr>
+        <w:t xml:space="preserve">(new Tour </w:t>
+      </w:r>
+      <w:proofErr w:type="gramStart"/>
+      <w:r>
+        <w:rPr>
+          <w:lang w:val="en-US"/>
+        </w:rPr>
+        <w:t xml:space="preserve">{ </w:t>
+      </w:r>
+      <w:proofErr w:type="spellStart"/>
+      <w:r>
+        <w:rPr>
+          <w:lang w:val="en-US"/>
+        </w:rPr>
+        <w:t>TourId</w:t>
+      </w:r>
+      <w:proofErr w:type="spellEnd"/>
+      <w:proofErr w:type="gramEnd"/>
+      <w:r>
+        <w:rPr>
+          <w:lang w:val="en-US"/>
+        </w:rPr>
+        <w:t xml:space="preserve"> = 1, </w:t>
+      </w:r>
+      <w:proofErr w:type="spellStart"/>
+      <w:r>
+        <w:rPr>
+          <w:lang w:val="en-US"/>
+        </w:rPr>
+        <w:t>TourName</w:t>
+      </w:r>
+      <w:proofErr w:type="spellEnd"/>
+      <w:r>
+        <w:rPr>
+          <w:lang w:val="en-US"/>
+        </w:rPr>
+        <w:t xml:space="preserve"> = "</w:t>
+      </w:r>
+      <w:proofErr w:type="spellStart"/>
+      <w:r>
+        <w:rPr>
+          <w:lang w:val="en-US"/>
+        </w:rPr>
+        <w:t>Париж</w:t>
+      </w:r>
+      <w:proofErr w:type="spellEnd"/>
+      <w:r>
+        <w:rPr>
+          <w:lang w:val="en-US"/>
+        </w:rPr>
+        <w:t xml:space="preserve">", </w:t>
+      </w:r>
+      <w:proofErr w:type="spellStart"/>
+      <w:r>
+        <w:rPr>
+          <w:lang w:val="en-US"/>
+        </w:rPr>
+        <w:t>HotelId</w:t>
+      </w:r>
+      <w:proofErr w:type="spellEnd"/>
+      <w:r>
+        <w:rPr>
+          <w:lang w:val="en-US"/>
+        </w:rPr>
+        <w:t xml:space="preserve"> = </w:t>
+      </w:r>
+      <w:proofErr w:type="gramStart"/>
+      <w:r>
+        <w:rPr>
+          <w:lang w:val="en-US"/>
+        </w:rPr>
+        <w:t>1 });</w:t>
+      </w:r>
+      <w:proofErr w:type="gramEnd"/>
+    </w:p>
+    <w:p>
+      <w:pPr>
+        <w:pStyle w:val="ac"/>
+        <w:rPr>
+          <w:lang w:val="en-US"/>
+        </w:rPr>
+      </w:pPr>
+      <w:r>
+        <w:rPr>
+          <w:lang w:val="en-US"/>
+        </w:rPr>
+        <w:t xml:space="preserve">    </w:t>
+      </w:r>
+      <w:proofErr w:type="spellStart"/>
+      <w:proofErr w:type="gramStart"/>
+      <w:r>
+        <w:rPr>
+          <w:lang w:val="en-US"/>
+        </w:rPr>
+        <w:t>context.Tours.Add</w:t>
+      </w:r>
+      <w:proofErr w:type="spellEnd"/>
+      <w:proofErr w:type="gramEnd"/>
+      <w:r>
+        <w:rPr>
+          <w:lang w:val="en-US"/>
+        </w:rPr>
+        <w:t xml:space="preserve">(new Tour </w:t>
+      </w:r>
+      <w:proofErr w:type="gramStart"/>
+      <w:r>
+        <w:rPr>
+          <w:lang w:val="en-US"/>
+        </w:rPr>
+        <w:t xml:space="preserve">{ </w:t>
+      </w:r>
+      <w:proofErr w:type="spellStart"/>
+      <w:r>
+        <w:rPr>
+          <w:lang w:val="en-US"/>
+        </w:rPr>
+        <w:t>TourId</w:t>
+      </w:r>
+      <w:proofErr w:type="spellEnd"/>
+      <w:proofErr w:type="gramEnd"/>
+      <w:r>
+        <w:rPr>
+          <w:lang w:val="en-US"/>
+        </w:rPr>
+        <w:t xml:space="preserve"> = 2, </w:t>
+      </w:r>
+      <w:proofErr w:type="spellStart"/>
+      <w:r>
+        <w:rPr>
+          <w:lang w:val="en-US"/>
+        </w:rPr>
+        <w:t>TourName</w:t>
+      </w:r>
+      <w:proofErr w:type="spellEnd"/>
+      <w:r>
+        <w:rPr>
+          <w:lang w:val="en-US"/>
+        </w:rPr>
+        <w:t xml:space="preserve"> = "</w:t>
+      </w:r>
+      <w:proofErr w:type="spellStart"/>
+      <w:r>
+        <w:rPr>
+          <w:lang w:val="en-US"/>
+        </w:rPr>
+        <w:t>Лондон</w:t>
+      </w:r>
+      <w:proofErr w:type="spellEnd"/>
+      <w:r>
+        <w:rPr>
+          <w:lang w:val="en-US"/>
+        </w:rPr>
+        <w:t xml:space="preserve">", </w:t>
+      </w:r>
+      <w:proofErr w:type="spellStart"/>
+      <w:r>
+        <w:rPr>
+          <w:lang w:val="en-US"/>
+        </w:rPr>
+        <w:t>HotelId</w:t>
+      </w:r>
+      <w:proofErr w:type="spellEnd"/>
+      <w:r>
+        <w:rPr>
+          <w:lang w:val="en-US"/>
+        </w:rPr>
+        <w:t xml:space="preserve"> = </w:t>
+      </w:r>
+      <w:proofErr w:type="gramStart"/>
+      <w:r>
+        <w:rPr>
+          <w:lang w:val="en-US"/>
+        </w:rPr>
+        <w:t>1 });</w:t>
+      </w:r>
+      <w:proofErr w:type="gramEnd"/>
+    </w:p>
+    <w:p>
+      <w:pPr>
+        <w:pStyle w:val="ac"/>
+        <w:rPr>
+          <w:lang w:val="en-US"/>
+        </w:rPr>
+      </w:pPr>
+      <w:r>
+        <w:rPr>
+          <w:lang w:val="en-US"/>
+        </w:rPr>
+        <w:t xml:space="preserve">    await </w:t>
+      </w:r>
+      <w:proofErr w:type="spellStart"/>
+      <w:proofErr w:type="gramStart"/>
+      <w:r>
+        <w:rPr>
+          <w:lang w:val="en-US"/>
+        </w:rPr>
+        <w:t>context.SaveChangesAsync</w:t>
+      </w:r>
+      <w:proofErr w:type="spellEnd"/>
+      <w:proofErr w:type="gramEnd"/>
+      <w:r>
+        <w:rPr>
+          <w:lang w:val="en-US"/>
+        </w:rPr>
+        <w:t>(</w:t>
+      </w:r>
+      <w:proofErr w:type="gramStart"/>
+      <w:r>
+        <w:rPr>
+          <w:lang w:val="en-US"/>
+        </w:rPr>
+        <w:t>);</w:t>
+      </w:r>
+      <w:proofErr w:type="gramEnd"/>
+    </w:p>
+    <w:p>
+      <w:pPr>
+        <w:pStyle w:val="ac"/>
+        <w:rPr>
+          <w:lang w:val="en-US"/>
+        </w:rPr>
+      </w:pPr>
+    </w:p>
+    <w:p>
+      <w:pPr>
+        <w:pStyle w:val="ac"/>
+        <w:rPr>
+          <w:lang w:val="en-US"/>
+        </w:rPr>
+      </w:pPr>
+      <w:r>
+        <w:rPr>
+          <w:lang w:val="en-US"/>
+        </w:rPr>
+        <w:t xml:space="preserve">    var controller = new </w:t>
+      </w:r>
+      <w:proofErr w:type="spellStart"/>
+      <w:r>
+        <w:rPr>
+          <w:lang w:val="en-US"/>
+        </w:rPr>
+        <w:t>ToursController</w:t>
+      </w:r>
+      <w:proofErr w:type="spellEnd"/>
+      <w:r>
+        <w:rPr>
+          <w:lang w:val="en-US"/>
+        </w:rPr>
+        <w:t>(context</w:t>
+      </w:r>
+      <w:proofErr w:type="gramStart"/>
+      <w:r>
+        <w:rPr>
+          <w:lang w:val="en-US"/>
+        </w:rPr>
+        <w:t>);</w:t>
+      </w:r>
+      <w:proofErr w:type="gramEnd"/>
+    </w:p>
+    <w:p>
+      <w:pPr>
+        <w:pStyle w:val="ac"/>
+      </w:pPr>
+      <w:r>
+        <w:rPr>
+          <w:lang w:val="en-US"/>
+        </w:rPr>
+        <w:t xml:space="preserve">    var result = await </w:t>
+      </w:r>
+      <w:proofErr w:type="spellStart"/>
+      <w:proofErr w:type="gramStart"/>
+      <w:r>
+        <w:rPr>
+          <w:lang w:val="en-US"/>
+        </w:rPr>
+        <w:t>controller.Index</w:t>
+      </w:r>
+      <w:proofErr w:type="spellEnd"/>
+      <w:proofErr w:type="gramEnd"/>
+      <w:r>
+        <w:rPr>
+          <w:lang w:val="en-US"/>
+        </w:rPr>
+        <w:t>(</w:t>
+      </w:r>
+      <w:proofErr w:type="gramStart"/>
+      <w:r>
+        <w:rPr>
+          <w:lang w:val="en-US"/>
+        </w:rPr>
+        <w:t>);</w:t>
+      </w:r>
+      <w:proofErr w:type="gramEnd"/>
+    </w:p>
+    <w:p>
+      <w:pPr>
+        <w:pStyle w:val="ac"/>
+      </w:pPr>
+    </w:p>
+    <w:p>
+      <w:pPr>
+        <w:pStyle w:val="ac"/>
+        <w:rPr>
+          <w:lang w:val="en-US"/>
+        </w:rPr>
+      </w:pPr>
+      <w:r>
+        <w:rPr>
+          <w:lang w:val="en-US"/>
+        </w:rPr>
+        <w:t xml:space="preserve">    var </w:t>
+      </w:r>
+      <w:proofErr w:type="spellStart"/>
+      <w:r>
+        <w:rPr>
+          <w:lang w:val="en-US"/>
+        </w:rPr>
+        <w:t>viewResult</w:t>
+      </w:r>
+      <w:proofErr w:type="spellEnd"/>
+      <w:r>
+        <w:rPr>
+          <w:lang w:val="en-US"/>
+        </w:rPr>
+        <w:t xml:space="preserve"> = </w:t>
+      </w:r>
+      <w:proofErr w:type="spellStart"/>
+      <w:r>
+        <w:rPr>
+          <w:lang w:val="en-US"/>
+        </w:rPr>
+        <w:t>Assert.IsType</w:t>
+      </w:r>
+      <w:proofErr w:type="spellEnd"/>
+      <w:r>
+        <w:rPr>
+          <w:lang w:val="en-US"/>
+        </w:rPr>
+        <w:t>&lt;</w:t>
+      </w:r>
+      <w:proofErr w:type="spellStart"/>
+      <w:r>
+        <w:rPr>
+          <w:lang w:val="en-US"/>
+        </w:rPr>
+        <w:t>ViewResult</w:t>
+      </w:r>
+      <w:proofErr w:type="spellEnd"/>
+      <w:r>
+        <w:rPr>
+          <w:lang w:val="en-US"/>
+        </w:rPr>
+        <w:t>&gt;(result</w:t>
+      </w:r>
+      <w:proofErr w:type="gramStart"/>
+      <w:r>
+        <w:rPr>
+          <w:lang w:val="en-US"/>
+        </w:rPr>
+        <w:t>);</w:t>
+      </w:r>
+      <w:proofErr w:type="gramEnd"/>
+    </w:p>
+    <w:p>
+      <w:pPr>
+        <w:pStyle w:val="ac"/>
+        <w:rPr>
+          <w:lang w:val="en-US"/>
+        </w:rPr>
+      </w:pPr>
+      <w:r>
+        <w:rPr>
+          <w:lang w:val="en-US"/>
+        </w:rPr>
+        <w:t xml:space="preserve">    var model = Assert.IsAssignableFrom&lt;IEnumerable&lt;Tour&gt;&gt;(</w:t>
+      </w:r>
+      <w:proofErr w:type="gramStart"/>
+      <w:r>
+        <w:rPr>
+          <w:lang w:val="en-US"/>
+        </w:rPr>
+        <w:t>viewResult.ViewData.Model);</w:t>
+      </w:r>
+      <w:proofErr w:type="gramEnd"/>
+    </w:p>
+    <w:p>
+      <w:pPr>
+        <w:pStyle w:val="ac"/>
+        <w:rPr>
+          <w:lang w:val="en-US"/>
+        </w:rPr>
+      </w:pPr>
+      <w:r>
+        <w:rPr>
+          <w:lang w:val="en-US"/>
+        </w:rPr>
+        <w:t xml:space="preserve">    </w:t>
+      </w:r>
+      <w:proofErr w:type="spellStart"/>
+      <w:r>
+        <w:rPr>
+          <w:lang w:val="en-US"/>
+        </w:rPr>
+        <w:t>Assert.Equal</w:t>
+      </w:r>
+      <w:proofErr w:type="spellEnd"/>
+      <w:r>
+        <w:rPr>
+          <w:lang w:val="en-US"/>
+        </w:rPr>
+        <w:t xml:space="preserve">(2, </w:t>
+      </w:r>
+      <w:proofErr w:type="spellStart"/>
+      <w:proofErr w:type="gramStart"/>
+      <w:r>
+        <w:rPr>
+          <w:lang w:val="en-US"/>
+        </w:rPr>
+        <w:t>model.Count</w:t>
+      </w:r>
+      <w:proofErr w:type="spellEnd"/>
+      <w:proofErr w:type="gramEnd"/>
+      <w:r>
+        <w:rPr>
+          <w:lang w:val="en-US"/>
+        </w:rPr>
+        <w:t>()</w:t>
+      </w:r>
+      <w:proofErr w:type="gramStart"/>
+      <w:r>
+        <w:rPr>
+          <w:lang w:val="en-US"/>
+        </w:rPr>
+        <w:t>);</w:t>
+      </w:r>
+      <w:proofErr w:type="gramEnd"/>
+    </w:p>
+    <w:p>
+      <w:pPr>
+        <w:pStyle w:val="ac"/>
+      </w:pPr>
       <w:r>
         <w:rPr>
           <w:lang w:val="en-US"/>
@@ -5181,23 +5826,23 @@
     </w:p>
     <w:p>
       <w:pPr>
-        <w:pStyle w:val="10"/>
+        <w:pStyle w:val="Heading1"/>
         <w:numPr>
           <w:ilvl w:val="0"/>
           <w:numId w:val="0"/>
         </w:numPr>
         <w:jc w:val="center"/>
       </w:pPr>
-      <w:bookmarkStart w:id="20" w:name="_Toc226770192"/>
+      <w:bookmarkStart w:id="19" w:name="_Toc226770192"/>
       <w:r>
         <w:lastRenderedPageBreak/>
         <w:t>ЗАКЛЮЧЕНИЕ</w:t>
       </w:r>
-      <w:bookmarkEnd w:id="20"/>
-    </w:p>
-    <w:p>
-      <w:pPr>
-        <w:pStyle w:val="a3"/>
+      <w:bookmarkEnd w:id="19"/>
+    </w:p>
+    <w:p>
+      <w:pPr>
+        <w:pStyle w:val="a2"/>
       </w:pPr>
       <w:r>
         <w:t xml:space="preserve">Для прохождения практики </w:t>
@@ -5217,7 +5862,7 @@
     </w:p>
     <w:p>
       <w:pPr>
-        <w:pStyle w:val="a3"/>
+        <w:pStyle w:val="a2"/>
       </w:pPr>
       <w:r>
         <w:t>Цели производственной практики достигнуты:</w:t>
@@ -5341,19 +5986,19 @@
     </w:p>
     <w:p>
       <w:pPr>
-        <w:pStyle w:val="10"/>
+        <w:pStyle w:val="Heading1"/>
         <w:numPr>
           <w:ilvl w:val="0"/>
           <w:numId w:val="0"/>
         </w:numPr>
         <w:jc w:val="center"/>
       </w:pPr>
-      <w:bookmarkStart w:id="21" w:name="_Toc226770193"/>
+      <w:bookmarkStart w:id="20" w:name="_Toc226770193"/>
       <w:r>
         <w:lastRenderedPageBreak/>
         <w:t>СПИСОК ИСПОЛЬЗОВАННЫХ ИСТОЧНИКОВ</w:t>
       </w:r>
-      <w:bookmarkEnd w:id="21"/>
+      <w:bookmarkEnd w:id="20"/>
     </w:p>
     <w:p>
       <w:pPr>
@@ -5451,9 +6096,10 @@
       <w:hyperlink r:id="rId12" w:history="1">
         <w:r>
           <w:rPr>
-            <w:rStyle w:val="af7"/>
+            <w:rStyle w:val="Hyperlink"/>
             <w:color w:val="000000" w:themeColor="text1"/>
             <w:szCs w:val="28"/>
+            <w:u w:val="none"/>
           </w:rPr>
           <w:t>https://ibooks.ru/bookshelf/386796/reading</w:t>
         </w:r>
@@ -5511,9 +6157,10 @@
       <w:hyperlink r:id="rId13" w:history="1">
         <w:r>
           <w:rPr>
-            <w:rStyle w:val="af7"/>
+            <w:rStyle w:val="Hyperlink"/>
             <w:color w:val="000000" w:themeColor="text1"/>
             <w:szCs w:val="28"/>
+            <w:u w:val="none"/>
           </w:rPr>
           <w:t>https://znanium.ru/catalog/product/2083407</w:t>
         </w:r>
@@ -5557,7 +6204,7 @@
 </file>
 
 <file path=word/endnotes.xml><?xml version="1.0" encoding="utf-8"?>
-<w:endnotes xmlns:wpc="http://schemas.microsoft.com/office/word/2010/wordprocessingCanvas" xmlns:cx="http://schemas.microsoft.com/office/drawing/2014/chartex" xmlns:mc="http://schemas.openxmlformats.org/markup-compatibility/2006" xmlns:o="urn:schemas-microsoft-com:office:office" xmlns:r="http://schemas.openxmlformats.org/officeDocument/2006/relationships" xmlns:m="http://schemas.openxmlformats.org/officeDocument/2006/math" xmlns:v="urn:schemas-microsoft-com:vml" xmlns:wp14="http://schemas.microsoft.com/office/word/2010/wordprocessingDrawing" xmlns:wp="http://schemas.openxmlformats.org/drawingml/2006/wordprocessingDrawing" xmlns:w10="urn:schemas-microsoft-com:office:word" xmlns:w="http://schemas.openxmlformats.org/wordprocessingml/2006/main" xmlns:w14="http://schemas.microsoft.com/office/word/2010/wordml" xmlns:w15="http://schemas.microsoft.com/office/word/2012/wordml" xmlns:w16se="http://schemas.microsoft.com/office/word/2015/wordml/symex" xmlns:wpg="http://schemas.microsoft.com/office/word/2010/wordprocessingGroup" xmlns:wpi="http://schemas.microsoft.com/office/word/2010/wordprocessingInk" xmlns:wne="http://schemas.microsoft.com/office/word/2006/wordml" xmlns:wps="http://schemas.microsoft.com/office/word/2010/wordprocessingShape" mc:Ignorable="w14 w15 w16se wp14">
+<w:endnotes xmlns:wpc="http://schemas.microsoft.com/office/word/2010/wordprocessingCanvas" xmlns:cx="http://schemas.microsoft.com/office/drawing/2014/chartex" xmlns:cx1="http://schemas.microsoft.com/office/drawing/2015/9/8/chartex" xmlns:cx2="http://schemas.microsoft.com/office/drawing/2015/10/21/chartex" xmlns:cx3="http://schemas.microsoft.com/office/drawing/2016/5/9/chartex" xmlns:cx4="http://schemas.microsoft.com/office/drawing/2016/5/10/chartex" xmlns:cx5="http://schemas.microsoft.com/office/drawing/2016/5/11/chartex" xmlns:cx6="http://schemas.microsoft.com/office/drawing/2016/5/12/chartex" xmlns:cx7="http://schemas.microsoft.com/office/drawing/2016/5/13/chartex" xmlns:cx8="http://schemas.microsoft.com/office/drawing/2016/5/14/chartex" xmlns:mc="http://schemas.openxmlformats.org/markup-compatibility/2006" xmlns:aink="http://schemas.microsoft.com/office/drawing/2016/ink" xmlns:am3d="http://schemas.microsoft.com/office/drawing/2017/model3d" xmlns:o="urn:schemas-microsoft-com:office:office" xmlns:oel="http://schemas.microsoft.com/office/2019/extlst" xmlns:r="http://schemas.openxmlformats.org/officeDocument/2006/relationships" xmlns:m="http://schemas.openxmlformats.org/officeDocument/2006/math" xmlns:v="urn:schemas-microsoft-com:vml" xmlns:wp14="http://schemas.microsoft.com/office/word/2010/wordprocessingDrawing" xmlns:wp="http://schemas.openxmlformats.org/drawingml/2006/wordprocessingDrawing" xmlns:w10="urn:schemas-microsoft-com:office:word" xmlns:w="http://schemas.openxmlformats.org/wordprocessingml/2006/main" xmlns:w14="http://schemas.microsoft.com/office/word/2010/wordml" xmlns:w15="http://schemas.microsoft.com/office/word/2012/wordml" xmlns:w16cex="http://schemas.microsoft.com/office/word/2018/wordml/cex" xmlns:w16cid="http://schemas.microsoft.com/office/word/2016/wordml/cid" xmlns:w16="http://schemas.microsoft.com/office/word/2018/wordml" xmlns:w16du="http://schemas.microsoft.com/office/word/2023/wordml/word16du" xmlns:w16sdtdh="http://schemas.microsoft.com/office/word/2020/wordml/sdtdatahash" xmlns:w16sdtfl="http://schemas.microsoft.com/office/word/2024/wordml/sdtformatlock" xmlns:w16se="http://schemas.microsoft.com/office/word/2015/wordml/symex" xmlns:wpg="http://schemas.microsoft.com/office/word/2010/wordprocessingGroup" xmlns:wpi="http://schemas.microsoft.com/office/word/2010/wordprocessingInk" xmlns:wne="http://schemas.microsoft.com/office/word/2006/wordml" xmlns:wps="http://schemas.microsoft.com/office/word/2010/wordprocessingShape" mc:Ignorable="w14 w15 w16se w16cid w16 w16cex w16sdtdh w16sdtfl w16du wp14">
   <w:endnote w:type="separator" w:id="-1">
     <w:p>
       <w:r>
@@ -5576,7 +6223,7 @@
 </file>
 
 <file path=word/footer1.xml><?xml version="1.0" encoding="utf-8"?>
-<w:ftr xmlns:wpc="http://schemas.microsoft.com/office/word/2010/wordprocessingCanvas" xmlns:cx="http://schemas.microsoft.com/office/drawing/2014/chartex" xmlns:mc="http://schemas.openxmlformats.org/markup-compatibility/2006" xmlns:o="urn:schemas-microsoft-com:office:office" xmlns:r="http://schemas.openxmlformats.org/officeDocument/2006/relationships" xmlns:m="http://schemas.openxmlformats.org/officeDocument/2006/math" xmlns:v="urn:schemas-microsoft-com:vml" xmlns:wp14="http://schemas.microsoft.com/office/word/2010/wordprocessingDrawing" xmlns:wp="http://schemas.openxmlformats.org/drawingml/2006/wordprocessingDrawing" xmlns:w10="urn:schemas-microsoft-com:office:word" xmlns:w="http://schemas.openxmlformats.org/wordprocessingml/2006/main" xmlns:w14="http://schemas.microsoft.com/office/word/2010/wordml" xmlns:w15="http://schemas.microsoft.com/office/word/2012/wordml" xmlns:w16se="http://schemas.microsoft.com/office/word/2015/wordml/symex" xmlns:wpg="http://schemas.microsoft.com/office/word/2010/wordprocessingGroup" xmlns:wpi="http://schemas.microsoft.com/office/word/2010/wordprocessingInk" xmlns:wne="http://schemas.microsoft.com/office/word/2006/wordml" xmlns:wps="http://schemas.microsoft.com/office/word/2010/wordprocessingShape" mc:Ignorable="w14 w15 w16se wp14">
+<w:ftr xmlns:wpc="http://schemas.microsoft.com/office/word/2010/wordprocessingCanvas" xmlns:cx="http://schemas.microsoft.com/office/drawing/2014/chartex" xmlns:cx1="http://schemas.microsoft.com/office/drawing/2015/9/8/chartex" xmlns:cx2="http://schemas.microsoft.com/office/drawing/2015/10/21/chartex" xmlns:cx3="http://schemas.microsoft.com/office/drawing/2016/5/9/chartex" xmlns:cx4="http://schemas.microsoft.com/office/drawing/2016/5/10/chartex" xmlns:cx5="http://schemas.microsoft.com/office/drawing/2016/5/11/chartex" xmlns:cx6="http://schemas.microsoft.com/office/drawing/2016/5/12/chartex" xmlns:cx7="http://schemas.microsoft.com/office/drawing/2016/5/13/chartex" xmlns:cx8="http://schemas.microsoft.com/office/drawing/2016/5/14/chartex" xmlns:mc="http://schemas.openxmlformats.org/markup-compatibility/2006" xmlns:aink="http://schemas.microsoft.com/office/drawing/2016/ink" xmlns:am3d="http://schemas.microsoft.com/office/drawing/2017/model3d" xmlns:o="urn:schemas-microsoft-com:office:office" xmlns:oel="http://schemas.microsoft.com/office/2019/extlst" xmlns:r="http://schemas.openxmlformats.org/officeDocument/2006/relationships" xmlns:m="http://schemas.openxmlformats.org/officeDocument/2006/math" xmlns:v="urn:schemas-microsoft-com:vml" xmlns:wp14="http://schemas.microsoft.com/office/word/2010/wordprocessingDrawing" xmlns:wp="http://schemas.openxmlformats.org/drawingml/2006/wordprocessingDrawing" xmlns:w10="urn:schemas-microsoft-com:office:word" xmlns:w="http://schemas.openxmlformats.org/wordprocessingml/2006/main" xmlns:w14="http://schemas.microsoft.com/office/word/2010/wordml" xmlns:w15="http://schemas.microsoft.com/office/word/2012/wordml" xmlns:w16cex="http://schemas.microsoft.com/office/word/2018/wordml/cex" xmlns:w16cid="http://schemas.microsoft.com/office/word/2016/wordml/cid" xmlns:w16="http://schemas.microsoft.com/office/word/2018/wordml" xmlns:w16du="http://schemas.microsoft.com/office/word/2023/wordml/word16du" xmlns:w16sdtdh="http://schemas.microsoft.com/office/word/2020/wordml/sdtdatahash" xmlns:w16sdtfl="http://schemas.microsoft.com/office/word/2024/wordml/sdtformatlock" xmlns:w16se="http://schemas.microsoft.com/office/word/2015/wordml/symex" xmlns:wpg="http://schemas.microsoft.com/office/word/2010/wordprocessingGroup" xmlns:wpi="http://schemas.microsoft.com/office/word/2010/wordprocessingInk" xmlns:wne="http://schemas.microsoft.com/office/word/2006/wordml" xmlns:wps="http://schemas.microsoft.com/office/word/2010/wordprocessingShape" mc:Ignorable="w14 w15 w16se w16cid w16 w16cex w16sdtdh w16sdtfl w16du wp14">
   <w:sdt>
     <w:sdtPr>
       <w:id w:val="1643229897"/>
@@ -5585,11 +6232,10 @@
         <w:docPartUnique/>
       </w:docPartObj>
     </w:sdtPr>
-    <w:sdtEndPr/>
     <w:sdtContent>
       <w:p>
         <w:pPr>
-          <w:pStyle w:val="af4"/>
+          <w:pStyle w:val="Footer"/>
           <w:jc w:val="center"/>
         </w:pPr>
         <w:r>
@@ -5617,7 +6263,7 @@
 </file>
 
 <file path=word/footnotes.xml><?xml version="1.0" encoding="utf-8"?>
-<w:footnotes xmlns:wpc="http://schemas.microsoft.com/office/word/2010/wordprocessingCanvas" xmlns:cx="http://schemas.microsoft.com/office/drawing/2014/chartex" xmlns:mc="http://schemas.openxmlformats.org/markup-compatibility/2006" xmlns:o="urn:schemas-microsoft-com:office:office" xmlns:r="http://schemas.openxmlformats.org/officeDocument/2006/relationships" xmlns:m="http://schemas.openxmlformats.org/officeDocument/2006/math" xmlns:v="urn:schemas-microsoft-com:vml" xmlns:wp14="http://schemas.microsoft.com/office/word/2010/wordprocessingDrawing" xmlns:wp="http://schemas.openxmlformats.org/drawingml/2006/wordprocessingDrawing" xmlns:w10="urn:schemas-microsoft-com:office:word" xmlns:w="http://schemas.openxmlformats.org/wordprocessingml/2006/main" xmlns:w14="http://schemas.microsoft.com/office/word/2010/wordml" xmlns:w15="http://schemas.microsoft.com/office/word/2012/wordml" xmlns:w16se="http://schemas.microsoft.com/office/word/2015/wordml/symex" xmlns:wpg="http://schemas.microsoft.com/office/word/2010/wordprocessingGroup" xmlns:wpi="http://schemas.microsoft.com/office/word/2010/wordprocessingInk" xmlns:wne="http://schemas.microsoft.com/office/word/2006/wordml" xmlns:wps="http://schemas.microsoft.com/office/word/2010/wordprocessingShape" mc:Ignorable="w14 w15 w16se wp14">
+<w:footnotes xmlns:wpc="http://schemas.microsoft.com/office/word/2010/wordprocessingCanvas" xmlns:cx="http://schemas.microsoft.com/office/drawing/2014/chartex" xmlns:cx1="http://schemas.microsoft.com/office/drawing/2015/9/8/chartex" xmlns:cx2="http://schemas.microsoft.com/office/drawing/2015/10/21/chartex" xmlns:cx3="http://schemas.microsoft.com/office/drawing/2016/5/9/chartex" xmlns:cx4="http://schemas.microsoft.com/office/drawing/2016/5/10/chartex" xmlns:cx5="http://schemas.microsoft.com/office/drawing/2016/5/11/chartex" xmlns:cx6="http://schemas.microsoft.com/office/drawing/2016/5/12/chartex" xmlns:cx7="http://schemas.microsoft.com/office/drawing/2016/5/13/chartex" xmlns:cx8="http://schemas.microsoft.com/office/drawing/2016/5/14/chartex" xmlns:mc="http://schemas.openxmlformats.org/markup-compatibility/2006" xmlns:aink="http://schemas.microsoft.com/office/drawing/2016/ink" xmlns:am3d="http://schemas.microsoft.com/office/drawing/2017/model3d" xmlns:o="urn:schemas-microsoft-com:office:office" xmlns:oel="http://schemas.microsoft.com/office/2019/extlst" xmlns:r="http://schemas.openxmlformats.org/officeDocument/2006/relationships" xmlns:m="http://schemas.openxmlformats.org/officeDocument/2006/math" xmlns:v="urn:schemas-microsoft-com:vml" xmlns:wp14="http://schemas.microsoft.com/office/word/2010/wordprocessingDrawing" xmlns:wp="http://schemas.openxmlformats.org/drawingml/2006/wordprocessingDrawing" xmlns:w10="urn:schemas-microsoft-com:office:word" xmlns:w="http://schemas.openxmlformats.org/wordprocessingml/2006/main" xmlns:w14="http://schemas.microsoft.com/office/word/2010/wordml" xmlns:w15="http://schemas.microsoft.com/office/word/2012/wordml" xmlns:w16cex="http://schemas.microsoft.com/office/word/2018/wordml/cex" xmlns:w16cid="http://schemas.microsoft.com/office/word/2016/wordml/cid" xmlns:w16="http://schemas.microsoft.com/office/word/2018/wordml" xmlns:w16du="http://schemas.microsoft.com/office/word/2023/wordml/word16du" xmlns:w16sdtdh="http://schemas.microsoft.com/office/word/2020/wordml/sdtdatahash" xmlns:w16sdtfl="http://schemas.microsoft.com/office/word/2024/wordml/sdtformatlock" xmlns:w16se="http://schemas.microsoft.com/office/word/2015/wordml/symex" xmlns:wpg="http://schemas.microsoft.com/office/word/2010/wordprocessingGroup" xmlns:wpi="http://schemas.microsoft.com/office/word/2010/wordprocessingInk" xmlns:wne="http://schemas.microsoft.com/office/word/2006/wordml" xmlns:wps="http://schemas.microsoft.com/office/word/2010/wordprocessingShape" mc:Ignorable="w14 w15 w16se w16cid w16 w16cex w16sdtdh w16sdtfl w16du wp14">
   <w:footnote w:type="separator" w:id="-1">
     <w:p>
       <w:r>
@@ -5636,7 +6282,7 @@
 </file>
 
 <file path=word/numbering.xml><?xml version="1.0" encoding="utf-8"?>
-<w:numbering xmlns:wpc="http://schemas.microsoft.com/office/word/2010/wordprocessingCanvas" xmlns:cx="http://schemas.microsoft.com/office/drawing/2014/chartex" xmlns:mc="http://schemas.openxmlformats.org/markup-compatibility/2006" xmlns:o="urn:schemas-microsoft-com:office:office" xmlns:r="http://schemas.openxmlformats.org/officeDocument/2006/relationships" xmlns:m="http://schemas.openxmlformats.org/officeDocument/2006/math" xmlns:v="urn:schemas-microsoft-com:vml" xmlns:wp14="http://schemas.microsoft.com/office/word/2010/wordprocessingDrawing" xmlns:wp="http://schemas.openxmlformats.org/drawingml/2006/wordprocessingDrawing" xmlns:w10="urn:schemas-microsoft-com:office:word" xmlns:w="http://schemas.openxmlformats.org/wordprocessingml/2006/main" xmlns:w14="http://schemas.microsoft.com/office/word/2010/wordml" xmlns:w15="http://schemas.microsoft.com/office/word/2012/wordml" xmlns:w16se="http://schemas.microsoft.com/office/word/2015/wordml/symex" xmlns:wpg="http://schemas.microsoft.com/office/word/2010/wordprocessingGroup" xmlns:wpi="http://schemas.microsoft.com/office/word/2010/wordprocessingInk" xmlns:wne="http://schemas.microsoft.com/office/word/2006/wordml" xmlns:wps="http://schemas.microsoft.com/office/word/2010/wordprocessingShape" mc:Ignorable="w14 w15 w16se wp14">
+<w:numbering xmlns:wpc="http://schemas.microsoft.com/office/word/2010/wordprocessingCanvas" xmlns:cx="http://schemas.microsoft.com/office/drawing/2014/chartex" xmlns:cx1="http://schemas.microsoft.com/office/drawing/2015/9/8/chartex" xmlns:cx2="http://schemas.microsoft.com/office/drawing/2015/10/21/chartex" xmlns:cx3="http://schemas.microsoft.com/office/drawing/2016/5/9/chartex" xmlns:cx4="http://schemas.microsoft.com/office/drawing/2016/5/10/chartex" xmlns:cx5="http://schemas.microsoft.com/office/drawing/2016/5/11/chartex" xmlns:cx6="http://schemas.microsoft.com/office/drawing/2016/5/12/chartex" xmlns:cx7="http://schemas.microsoft.com/office/drawing/2016/5/13/chartex" xmlns:cx8="http://schemas.microsoft.com/office/drawing/2016/5/14/chartex" xmlns:mc="http://schemas.openxmlformats.org/markup-compatibility/2006" xmlns:aink="http://schemas.microsoft.com/office/drawing/2016/ink" xmlns:am3d="http://schemas.microsoft.com/office/drawing/2017/model3d" xmlns:o="urn:schemas-microsoft-com:office:office" xmlns:oel="http://schemas.microsoft.com/office/2019/extlst" xmlns:r="http://schemas.openxmlformats.org/officeDocument/2006/relationships" xmlns:m="http://schemas.openxmlformats.org/officeDocument/2006/math" xmlns:v="urn:schemas-microsoft-com:vml" xmlns:wp14="http://schemas.microsoft.com/office/word/2010/wordprocessingDrawing" xmlns:wp="http://schemas.openxmlformats.org/drawingml/2006/wordprocessingDrawing" xmlns:w10="urn:schemas-microsoft-com:office:word" xmlns:w="http://schemas.openxmlformats.org/wordprocessingml/2006/main" xmlns:w14="http://schemas.microsoft.com/office/word/2010/wordml" xmlns:w15="http://schemas.microsoft.com/office/word/2012/wordml" xmlns:w16cex="http://schemas.microsoft.com/office/word/2018/wordml/cex" xmlns:w16cid="http://schemas.microsoft.com/office/word/2016/wordml/cid" xmlns:w16="http://schemas.microsoft.com/office/word/2018/wordml" xmlns:w16du="http://schemas.microsoft.com/office/word/2023/wordml/word16du" xmlns:w16sdtdh="http://schemas.microsoft.com/office/word/2020/wordml/sdtdatahash" xmlns:w16sdtfl="http://schemas.microsoft.com/office/word/2024/wordml/sdtformatlock" xmlns:w16se="http://schemas.microsoft.com/office/word/2015/wordml/symex" xmlns:wpg="http://schemas.microsoft.com/office/word/2010/wordprocessingGroup" xmlns:wpi="http://schemas.microsoft.com/office/word/2010/wordprocessingInk" xmlns:wne="http://schemas.microsoft.com/office/word/2006/wordml" xmlns:wps="http://schemas.microsoft.com/office/word/2010/wordprocessingShape" mc:Ignorable="w14 w15 w16se w16cid w16 w16cex w16sdtdh w16sdtfl w16du wp14">
   <w:abstractNum w:abstractNumId="0" w15:restartNumberingAfterBreak="0">
     <w:nsid w:val="02CB4D21"/>
     <w:multiLevelType w:val="multilevel"/>
@@ -6776,7 +7422,7 @@
     <w:lvl w:ilvl="0">
       <w:start w:val="1"/>
       <w:numFmt w:val="decimal"/>
-      <w:pStyle w:val="10"/>
+      <w:pStyle w:val="Heading1"/>
       <w:suff w:val="space"/>
       <w:lvlText w:val="%1"/>
       <w:lvlJc w:val="left"/>
@@ -6793,7 +7439,7 @@
     <w:lvl w:ilvl="1">
       <w:start w:val="1"/>
       <w:numFmt w:val="decimal"/>
-      <w:pStyle w:val="2"/>
+      <w:pStyle w:val="Heading2"/>
       <w:suff w:val="space"/>
       <w:lvlText w:val="%1.%2"/>
       <w:lvlJc w:val="left"/>
@@ -6809,7 +7455,7 @@
     <w:lvl w:ilvl="2">
       <w:start w:val="1"/>
       <w:numFmt w:val="decimal"/>
-      <w:pStyle w:val="3"/>
+      <w:pStyle w:val="Heading3"/>
       <w:suff w:val="space"/>
       <w:lvlText w:val="%1.%2.%3"/>
       <w:lvlJc w:val="left"/>
@@ -6826,7 +7472,7 @@
     <w:lvl w:ilvl="3">
       <w:start w:val="1"/>
       <w:numFmt w:val="decimal"/>
-      <w:pStyle w:val="4"/>
+      <w:pStyle w:val="Heading4"/>
       <w:suff w:val="space"/>
       <w:lvlText w:val="%1.%2.%3.%4"/>
       <w:lvlJc w:val="left"/>
@@ -6843,7 +7489,7 @@
     <w:lvl w:ilvl="4">
       <w:start w:val="1"/>
       <w:numFmt w:val="decimal"/>
-      <w:pStyle w:val="5"/>
+      <w:pStyle w:val="Heading5"/>
       <w:suff w:val="space"/>
       <w:lvlText w:val="%1.%2.%3.%4.%5"/>
       <w:lvlJc w:val="left"/>
@@ -6860,7 +7506,7 @@
     <w:lvl w:ilvl="5">
       <w:start w:val="1"/>
       <w:numFmt w:val="decimal"/>
-      <w:pStyle w:val="6"/>
+      <w:pStyle w:val="Heading6"/>
       <w:suff w:val="space"/>
       <w:lvlText w:val="%1.%2.%3.%4.%5.%6"/>
       <w:lvlJc w:val="left"/>
@@ -6877,7 +7523,7 @@
     <w:lvl w:ilvl="6">
       <w:start w:val="1"/>
       <w:numFmt w:val="decimal"/>
-      <w:pStyle w:val="7"/>
+      <w:pStyle w:val="Heading7"/>
       <w:suff w:val="space"/>
       <w:lvlText w:val="%1.%2.%3.%4.%5.%6.%7"/>
       <w:lvlJc w:val="left"/>
@@ -6894,7 +7540,7 @@
     <w:lvl w:ilvl="7">
       <w:start w:val="1"/>
       <w:numFmt w:val="decimal"/>
-      <w:pStyle w:val="8"/>
+      <w:pStyle w:val="Heading8"/>
       <w:suff w:val="space"/>
       <w:lvlText w:val="%1.%2.%3.%4.%5.%6.%7.%8"/>
       <w:lvlJc w:val="left"/>
@@ -6911,7 +7557,7 @@
     <w:lvl w:ilvl="8">
       <w:start w:val="1"/>
       <w:numFmt w:val="decimal"/>
-      <w:pStyle w:val="9"/>
+      <w:pStyle w:val="Heading9"/>
       <w:suff w:val="space"/>
       <w:lvlText w:val="%1.%2.%3.%4.%5.%6.%7.%8.%9"/>
       <w:lvlJc w:val="left"/>
@@ -7039,43 +7685,43 @@
       </w:pPr>
     </w:lvl>
   </w:abstractNum>
-  <w:num w:numId="1">
+  <w:num w:numId="1" w16cid:durableId="1722943322">
     <w:abstractNumId w:val="10"/>
   </w:num>
-  <w:num w:numId="2">
+  <w:num w:numId="2" w16cid:durableId="521667135">
     <w:abstractNumId w:val="5"/>
   </w:num>
-  <w:num w:numId="3">
+  <w:num w:numId="3" w16cid:durableId="1333141419">
     <w:abstractNumId w:val="3"/>
   </w:num>
-  <w:num w:numId="4">
+  <w:num w:numId="4" w16cid:durableId="966743954">
     <w:abstractNumId w:val="3"/>
     <w:lvlOverride w:ilvl="0">
       <w:startOverride w:val="1"/>
     </w:lvlOverride>
   </w:num>
-  <w:num w:numId="5">
+  <w:num w:numId="5" w16cid:durableId="1973092922">
     <w:abstractNumId w:val="3"/>
     <w:lvlOverride w:ilvl="0">
       <w:startOverride w:val="1"/>
     </w:lvlOverride>
   </w:num>
-  <w:num w:numId="6">
+  <w:num w:numId="6" w16cid:durableId="1337541465">
     <w:abstractNumId w:val="7"/>
   </w:num>
-  <w:num w:numId="7">
+  <w:num w:numId="7" w16cid:durableId="306207106">
     <w:abstractNumId w:val="8"/>
   </w:num>
-  <w:num w:numId="8">
+  <w:num w:numId="8" w16cid:durableId="1335256349">
     <w:abstractNumId w:val="2"/>
   </w:num>
-  <w:num w:numId="9">
+  <w:num w:numId="9" w16cid:durableId="1665082441">
     <w:abstractNumId w:val="1"/>
   </w:num>
-  <w:num w:numId="10">
+  <w:num w:numId="10" w16cid:durableId="107160949">
     <w:abstractNumId w:val="11"/>
   </w:num>
-  <w:num w:numId="11">
+  <w:num w:numId="11" w16cid:durableId="1384593640">
     <w:abstractNumId w:val="10"/>
     <w:lvlOverride w:ilvl="0">
       <w:startOverride w:val="1"/>
@@ -7105,29 +7751,29 @@
       <w:startOverride w:val="1"/>
     </w:lvlOverride>
   </w:num>
-  <w:num w:numId="12">
+  <w:num w:numId="12" w16cid:durableId="1623807609">
     <w:abstractNumId w:val="1"/>
     <w:lvlOverride w:ilvl="0">
       <w:startOverride w:val="1"/>
     </w:lvlOverride>
   </w:num>
-  <w:num w:numId="13">
+  <w:num w:numId="13" w16cid:durableId="1559702822">
     <w:abstractNumId w:val="4"/>
   </w:num>
-  <w:num w:numId="14">
+  <w:num w:numId="14" w16cid:durableId="790514309">
     <w:abstractNumId w:val="9"/>
   </w:num>
-  <w:num w:numId="15">
+  <w:num w:numId="15" w16cid:durableId="1957101892">
     <w:abstractNumId w:val="0"/>
   </w:num>
-  <w:num w:numId="16">
+  <w:num w:numId="16" w16cid:durableId="504058586">
     <w:abstractNumId w:val="6"/>
   </w:num>
 </w:numbering>
 </file>
 
 <file path=word/styles.xml><?xml version="1.0" encoding="utf-8"?>
-<w:styles xmlns:mc="http://schemas.openxmlformats.org/markup-compatibility/2006" xmlns:r="http://schemas.openxmlformats.org/officeDocument/2006/relationships" xmlns:w="http://schemas.openxmlformats.org/wordprocessingml/2006/main" xmlns:w14="http://schemas.microsoft.com/office/word/2010/wordml" xmlns:w15="http://schemas.microsoft.com/office/word/2012/wordml" xmlns:w16se="http://schemas.microsoft.com/office/word/2015/wordml/symex" mc:Ignorable="w14 w15 w16se">
+<w:styles xmlns:mc="http://schemas.openxmlformats.org/markup-compatibility/2006" xmlns:r="http://schemas.openxmlformats.org/officeDocument/2006/relationships" xmlns:w="http://schemas.openxmlformats.org/wordprocessingml/2006/main" xmlns:w14="http://schemas.microsoft.com/office/word/2010/wordml" xmlns:w15="http://schemas.microsoft.com/office/word/2012/wordml" xmlns:w16cex="http://schemas.microsoft.com/office/word/2018/wordml/cex" xmlns:w16cid="http://schemas.microsoft.com/office/word/2016/wordml/cid" xmlns:w16="http://schemas.microsoft.com/office/word/2018/wordml" xmlns:w16du="http://schemas.microsoft.com/office/word/2023/wordml/word16du" xmlns:w16sdtdh="http://schemas.microsoft.com/office/word/2020/wordml/sdtdatahash" xmlns:w16sdtfl="http://schemas.microsoft.com/office/word/2024/wordml/sdtformatlock" xmlns:w16se="http://schemas.microsoft.com/office/word/2015/wordml/symex" mc:Ignorable="w14 w15 w16se w16cid w16 w16cex w16sdtdh w16sdtfl w16du">
   <w:docDefaults>
     <w:rPrDefault>
       <w:rPr>
@@ -7145,7 +7791,7 @@
       </w:pPr>
     </w:pPrDefault>
   </w:docDefaults>
-  <w:latentStyles w:defLockedState="0" w:defUIPriority="99" w:defSemiHidden="0" w:defUnhideWhenUsed="0" w:defQFormat="0" w:count="371">
+  <w:latentStyles w:defLockedState="0" w:defUIPriority="99" w:defSemiHidden="0" w:defUnhideWhenUsed="0" w:defQFormat="0" w:count="376">
     <w:lsdException w:name="Normal" w:uiPriority="0" w:qFormat="1"/>
     <w:lsdException w:name="heading 1" w:uiPriority="9" w:qFormat="1"/>
     <w:lsdException w:name="heading 2" w:semiHidden="1" w:uiPriority="9" w:unhideWhenUsed="1" w:qFormat="1"/>
@@ -7517,8 +8163,13 @@
     <w:lsdException w:name="List Table 5 Dark Accent 6" w:uiPriority="50"/>
     <w:lsdException w:name="List Table 6 Colorful Accent 6" w:uiPriority="51"/>
     <w:lsdException w:name="List Table 7 Colorful Accent 6" w:uiPriority="52"/>
+    <w:lsdException w:name="Mention" w:semiHidden="1" w:unhideWhenUsed="1"/>
+    <w:lsdException w:name="Smart Hyperlink" w:semiHidden="1" w:unhideWhenUsed="1"/>
+    <w:lsdException w:name="Hashtag" w:semiHidden="1" w:unhideWhenUsed="1"/>
+    <w:lsdException w:name="Unresolved Mention" w:semiHidden="1" w:unhideWhenUsed="1"/>
+    <w:lsdException w:name="Smart Link" w:semiHidden="1" w:unhideWhenUsed="1"/>
   </w:latentStyles>
-  <w:style w:type="paragraph" w:default="1" w:styleId="a2">
+  <w:style w:type="paragraph" w:default="1" w:styleId="Normal">
     <w:name w:val="Normal"/>
     <w:qFormat/>
     <w:rsid w:val="00313BD4"/>
@@ -7531,11 +8182,11 @@
       <w:sz w:val="28"/>
     </w:rPr>
   </w:style>
-  <w:style w:type="paragraph" w:styleId="10">
+  <w:style w:type="paragraph" w:styleId="Heading1">
     <w:name w:val="heading 1"/>
-    <w:basedOn w:val="a2"/>
-    <w:next w:val="a3"/>
-    <w:link w:val="11"/>
+    <w:basedOn w:val="Normal"/>
+    <w:next w:val="a2"/>
+    <w:link w:val="Heading1Char"/>
     <w:uiPriority w:val="9"/>
     <w:qFormat/>
     <w:rsid w:val="005C6335"/>
@@ -7557,11 +8208,11 @@
       <w:szCs w:val="40"/>
     </w:rPr>
   </w:style>
-  <w:style w:type="paragraph" w:styleId="2">
+  <w:style w:type="paragraph" w:styleId="Heading2">
     <w:name w:val="heading 2"/>
-    <w:basedOn w:val="10"/>
-    <w:next w:val="a3"/>
-    <w:link w:val="20"/>
+    <w:basedOn w:val="Heading1"/>
+    <w:next w:val="a2"/>
+    <w:link w:val="Heading2Char"/>
     <w:uiPriority w:val="9"/>
     <w:unhideWhenUsed/>
     <w:qFormat/>
@@ -7579,11 +8230,11 @@
       <w:szCs w:val="32"/>
     </w:rPr>
   </w:style>
-  <w:style w:type="paragraph" w:styleId="3">
+  <w:style w:type="paragraph" w:styleId="Heading3">
     <w:name w:val="heading 3"/>
-    <w:basedOn w:val="2"/>
-    <w:next w:val="a3"/>
-    <w:link w:val="30"/>
+    <w:basedOn w:val="Heading2"/>
+    <w:next w:val="a2"/>
+    <w:link w:val="Heading3Char"/>
     <w:uiPriority w:val="9"/>
     <w:unhideWhenUsed/>
     <w:qFormat/>
@@ -7598,11 +8249,11 @@
       <w:szCs w:val="28"/>
     </w:rPr>
   </w:style>
-  <w:style w:type="paragraph" w:styleId="4">
+  <w:style w:type="paragraph" w:styleId="Heading4">
     <w:name w:val="heading 4"/>
-    <w:basedOn w:val="a2"/>
-    <w:next w:val="a2"/>
-    <w:link w:val="40"/>
+    <w:basedOn w:val="Normal"/>
+    <w:next w:val="Normal"/>
+    <w:link w:val="Heading4Char"/>
     <w:uiPriority w:val="9"/>
     <w:semiHidden/>
     <w:unhideWhenUsed/>
@@ -7624,11 +8275,11 @@
       <w:color w:val="0F4761" w:themeColor="accent1" w:themeShade="BF"/>
     </w:rPr>
   </w:style>
-  <w:style w:type="paragraph" w:styleId="5">
+  <w:style w:type="paragraph" w:styleId="Heading5">
     <w:name w:val="heading 5"/>
-    <w:basedOn w:val="a2"/>
-    <w:next w:val="a2"/>
-    <w:link w:val="50"/>
+    <w:basedOn w:val="Normal"/>
+    <w:next w:val="Normal"/>
+    <w:link w:val="Heading5Char"/>
     <w:uiPriority w:val="9"/>
     <w:semiHidden/>
     <w:unhideWhenUsed/>
@@ -7649,11 +8300,11 @@
       <w:color w:val="0F4761" w:themeColor="accent1" w:themeShade="BF"/>
     </w:rPr>
   </w:style>
-  <w:style w:type="paragraph" w:styleId="6">
+  <w:style w:type="paragraph" w:styleId="Heading6">
     <w:name w:val="heading 6"/>
-    <w:basedOn w:val="a2"/>
-    <w:next w:val="a2"/>
-    <w:link w:val="60"/>
+    <w:basedOn w:val="Normal"/>
+    <w:next w:val="Normal"/>
+    <w:link w:val="Heading6Char"/>
     <w:uiPriority w:val="9"/>
     <w:semiHidden/>
     <w:unhideWhenUsed/>
@@ -7676,11 +8327,11 @@
       <w:color w:val="595959" w:themeColor="text1" w:themeTint="A6"/>
     </w:rPr>
   </w:style>
-  <w:style w:type="paragraph" w:styleId="7">
+  <w:style w:type="paragraph" w:styleId="Heading7">
     <w:name w:val="heading 7"/>
-    <w:basedOn w:val="a2"/>
-    <w:next w:val="a2"/>
-    <w:link w:val="70"/>
+    <w:basedOn w:val="Normal"/>
+    <w:next w:val="Normal"/>
+    <w:link w:val="Heading7Char"/>
     <w:uiPriority w:val="9"/>
     <w:semiHidden/>
     <w:unhideWhenUsed/>
@@ -7701,11 +8352,11 @@
       <w:color w:val="595959" w:themeColor="text1" w:themeTint="A6"/>
     </w:rPr>
   </w:style>
-  <w:style w:type="paragraph" w:styleId="8">
+  <w:style w:type="paragraph" w:styleId="Heading8">
     <w:name w:val="heading 8"/>
-    <w:basedOn w:val="a2"/>
-    <w:next w:val="a2"/>
-    <w:link w:val="80"/>
+    <w:basedOn w:val="Normal"/>
+    <w:next w:val="Normal"/>
+    <w:link w:val="Heading8Char"/>
     <w:uiPriority w:val="9"/>
     <w:semiHidden/>
     <w:unhideWhenUsed/>
@@ -7727,11 +8378,11 @@
       <w:color w:val="272727" w:themeColor="text1" w:themeTint="D8"/>
     </w:rPr>
   </w:style>
-  <w:style w:type="paragraph" w:styleId="9">
+  <w:style w:type="paragraph" w:styleId="Heading9">
     <w:name w:val="heading 9"/>
-    <w:basedOn w:val="a2"/>
-    <w:next w:val="a2"/>
-    <w:link w:val="90"/>
+    <w:basedOn w:val="Normal"/>
+    <w:next w:val="Normal"/>
+    <w:link w:val="Heading9Char"/>
     <w:uiPriority w:val="9"/>
     <w:semiHidden/>
     <w:unhideWhenUsed/>
@@ -7751,13 +8402,12 @@
       <w:color w:val="272727" w:themeColor="text1" w:themeTint="D8"/>
     </w:rPr>
   </w:style>
-  <w:style w:type="character" w:default="1" w:styleId="a4">
+  <w:style w:type="character" w:default="1" w:styleId="DefaultParagraphFont">
     <w:name w:val="Default Paragraph Font"/>
     <w:uiPriority w:val="1"/>
-    <w:semiHidden/>
     <w:unhideWhenUsed/>
   </w:style>
-  <w:style w:type="table" w:default="1" w:styleId="a5">
+  <w:style w:type="table" w:default="1" w:styleId="TableNormal">
     <w:name w:val="Normal Table"/>
     <w:uiPriority w:val="99"/>
     <w:semiHidden/>
@@ -7772,16 +8422,16 @@
       </w:tblCellMar>
     </w:tblPr>
   </w:style>
-  <w:style w:type="numbering" w:default="1" w:styleId="a6">
+  <w:style w:type="numbering" w:default="1" w:styleId="NoList">
     <w:name w:val="No List"/>
     <w:uiPriority w:val="99"/>
     <w:semiHidden/>
     <w:unhideWhenUsed/>
   </w:style>
-  <w:style w:type="character" w:customStyle="1" w:styleId="11">
-    <w:name w:val="Заголовок 1 Знак"/>
-    <w:basedOn w:val="a4"/>
-    <w:link w:val="10"/>
+  <w:style w:type="character" w:customStyle="1" w:styleId="Heading1Char">
+    <w:name w:val="Heading 1 Char"/>
+    <w:basedOn w:val="DefaultParagraphFont"/>
+    <w:link w:val="Heading1"/>
     <w:uiPriority w:val="9"/>
     <w:rsid w:val="005C6335"/>
     <w:rPr>
@@ -7791,10 +8441,10 @@
       <w:szCs w:val="40"/>
     </w:rPr>
   </w:style>
-  <w:style w:type="character" w:customStyle="1" w:styleId="20">
-    <w:name w:val="Заголовок 2 Знак"/>
-    <w:basedOn w:val="a4"/>
-    <w:link w:val="2"/>
+  <w:style w:type="character" w:customStyle="1" w:styleId="Heading2Char">
+    <w:name w:val="Heading 2 Char"/>
+    <w:basedOn w:val="DefaultParagraphFont"/>
+    <w:link w:val="Heading2"/>
     <w:uiPriority w:val="9"/>
     <w:rsid w:val="007B1296"/>
     <w:rPr>
@@ -7804,10 +8454,10 @@
       <w:szCs w:val="32"/>
     </w:rPr>
   </w:style>
-  <w:style w:type="character" w:customStyle="1" w:styleId="30">
-    <w:name w:val="Заголовок 3 Знак"/>
-    <w:basedOn w:val="a4"/>
-    <w:link w:val="3"/>
+  <w:style w:type="character" w:customStyle="1" w:styleId="Heading3Char">
+    <w:name w:val="Heading 3 Char"/>
+    <w:basedOn w:val="DefaultParagraphFont"/>
+    <w:link w:val="Heading3"/>
     <w:uiPriority w:val="9"/>
     <w:rsid w:val="00135AB1"/>
     <w:rPr>
@@ -7817,10 +8467,10 @@
       <w:szCs w:val="28"/>
     </w:rPr>
   </w:style>
-  <w:style w:type="character" w:customStyle="1" w:styleId="40">
-    <w:name w:val="Заголовок 4 Знак"/>
-    <w:basedOn w:val="a4"/>
-    <w:link w:val="4"/>
+  <w:style w:type="character" w:customStyle="1" w:styleId="Heading4Char">
+    <w:name w:val="Heading 4 Char"/>
+    <w:basedOn w:val="DefaultParagraphFont"/>
+    <w:link w:val="Heading4"/>
     <w:uiPriority w:val="9"/>
     <w:semiHidden/>
     <w:rsid w:val="00313BD4"/>
@@ -7831,10 +8481,10 @@
       <w:color w:val="0F4761" w:themeColor="accent1" w:themeShade="BF"/>
     </w:rPr>
   </w:style>
-  <w:style w:type="character" w:customStyle="1" w:styleId="50">
-    <w:name w:val="Заголовок 5 Знак"/>
-    <w:basedOn w:val="a4"/>
-    <w:link w:val="5"/>
+  <w:style w:type="character" w:customStyle="1" w:styleId="Heading5Char">
+    <w:name w:val="Heading 5 Char"/>
+    <w:basedOn w:val="DefaultParagraphFont"/>
+    <w:link w:val="Heading5"/>
     <w:uiPriority w:val="9"/>
     <w:semiHidden/>
     <w:rsid w:val="00313BD4"/>
@@ -7843,10 +8493,10 @@
       <w:color w:val="0F4761" w:themeColor="accent1" w:themeShade="BF"/>
     </w:rPr>
   </w:style>
-  <w:style w:type="character" w:customStyle="1" w:styleId="60">
-    <w:name w:val="Заголовок 6 Знак"/>
-    <w:basedOn w:val="a4"/>
-    <w:link w:val="6"/>
+  <w:style w:type="character" w:customStyle="1" w:styleId="Heading6Char">
+    <w:name w:val="Heading 6 Char"/>
+    <w:basedOn w:val="DefaultParagraphFont"/>
+    <w:link w:val="Heading6"/>
     <w:uiPriority w:val="9"/>
     <w:semiHidden/>
     <w:rsid w:val="00313BD4"/>
@@ -7857,10 +8507,10 @@
       <w:color w:val="595959" w:themeColor="text1" w:themeTint="A6"/>
     </w:rPr>
   </w:style>
-  <w:style w:type="character" w:customStyle="1" w:styleId="70">
-    <w:name w:val="Заголовок 7 Знак"/>
-    <w:basedOn w:val="a4"/>
-    <w:link w:val="7"/>
+  <w:style w:type="character" w:customStyle="1" w:styleId="Heading7Char">
+    <w:name w:val="Heading 7 Char"/>
+    <w:basedOn w:val="DefaultParagraphFont"/>
+    <w:link w:val="Heading7"/>
     <w:uiPriority w:val="9"/>
     <w:semiHidden/>
     <w:rsid w:val="00313BD4"/>
@@ -7869,10 +8519,10 @@
       <w:color w:val="595959" w:themeColor="text1" w:themeTint="A6"/>
     </w:rPr>
   </w:style>
-  <w:style w:type="character" w:customStyle="1" w:styleId="80">
-    <w:name w:val="Заголовок 8 Знак"/>
-    <w:basedOn w:val="a4"/>
-    <w:link w:val="8"/>
+  <w:style w:type="character" w:customStyle="1" w:styleId="Heading8Char">
+    <w:name w:val="Heading 8 Char"/>
+    <w:basedOn w:val="DefaultParagraphFont"/>
+    <w:link w:val="Heading8"/>
     <w:uiPriority w:val="9"/>
     <w:semiHidden/>
     <w:rsid w:val="00313BD4"/>
@@ -7883,10 +8533,10 @@
       <w:color w:val="272727" w:themeColor="text1" w:themeTint="D8"/>
     </w:rPr>
   </w:style>
-  <w:style w:type="character" w:customStyle="1" w:styleId="90">
-    <w:name w:val="Заголовок 9 Знак"/>
-    <w:basedOn w:val="a4"/>
-    <w:link w:val="9"/>
+  <w:style w:type="character" w:customStyle="1" w:styleId="Heading9Char">
+    <w:name w:val="Heading 9 Char"/>
+    <w:basedOn w:val="DefaultParagraphFont"/>
+    <w:link w:val="Heading9"/>
     <w:uiPriority w:val="9"/>
     <w:semiHidden/>
     <w:rsid w:val="00313BD4"/>
@@ -7895,11 +8545,11 @@
       <w:color w:val="272727" w:themeColor="text1" w:themeTint="D8"/>
     </w:rPr>
   </w:style>
-  <w:style w:type="paragraph" w:styleId="a7">
+  <w:style w:type="paragraph" w:styleId="Title">
     <w:name w:val="Title"/>
-    <w:basedOn w:val="a2"/>
-    <w:next w:val="a3"/>
-    <w:link w:val="a8"/>
+    <w:basedOn w:val="Normal"/>
+    <w:next w:val="a2"/>
+    <w:link w:val="TitleChar"/>
     <w:uiPriority w:val="10"/>
     <w:qFormat/>
     <w:rsid w:val="008532F7"/>
@@ -7919,10 +8569,10 @@
       <w:szCs w:val="56"/>
     </w:rPr>
   </w:style>
-  <w:style w:type="character" w:customStyle="1" w:styleId="a8">
-    <w:name w:val="Заголовок Знак"/>
-    <w:basedOn w:val="a4"/>
-    <w:link w:val="a7"/>
+  <w:style w:type="character" w:customStyle="1" w:styleId="TitleChar">
+    <w:name w:val="Title Char"/>
+    <w:basedOn w:val="DefaultParagraphFont"/>
+    <w:link w:val="Title"/>
     <w:uiPriority w:val="10"/>
     <w:rsid w:val="008532F7"/>
     <w:rPr>
@@ -7935,11 +8585,11 @@
       <w:szCs w:val="56"/>
     </w:rPr>
   </w:style>
-  <w:style w:type="paragraph" w:styleId="a9">
+  <w:style w:type="paragraph" w:styleId="Subtitle">
     <w:name w:val="Subtitle"/>
-    <w:basedOn w:val="a2"/>
-    <w:next w:val="a2"/>
-    <w:link w:val="aa"/>
+    <w:basedOn w:val="Normal"/>
+    <w:next w:val="Normal"/>
+    <w:link w:val="SubtitleChar"/>
     <w:uiPriority w:val="11"/>
     <w:qFormat/>
     <w:rsid w:val="00313BD4"/>
@@ -7955,10 +8605,10 @@
       <w:szCs w:val="28"/>
     </w:rPr>
   </w:style>
-  <w:style w:type="character" w:customStyle="1" w:styleId="aa">
-    <w:name w:val="Подзаголовок Знак"/>
-    <w:basedOn w:val="a4"/>
-    <w:link w:val="a9"/>
+  <w:style w:type="character" w:customStyle="1" w:styleId="SubtitleChar">
+    <w:name w:val="Subtitle Char"/>
+    <w:basedOn w:val="DefaultParagraphFont"/>
+    <w:link w:val="Subtitle"/>
     <w:uiPriority w:val="11"/>
     <w:rsid w:val="00313BD4"/>
     <w:rPr>
@@ -7969,11 +8619,11 @@
       <w:szCs w:val="28"/>
     </w:rPr>
   </w:style>
-  <w:style w:type="paragraph" w:styleId="21">
+  <w:style w:type="paragraph" w:styleId="Quote">
     <w:name w:val="Quote"/>
-    <w:basedOn w:val="a2"/>
-    <w:next w:val="a2"/>
-    <w:link w:val="22"/>
+    <w:basedOn w:val="Normal"/>
+    <w:next w:val="Normal"/>
+    <w:link w:val="QuoteChar"/>
     <w:uiPriority w:val="29"/>
     <w:qFormat/>
     <w:rsid w:val="00313BD4"/>
@@ -7987,10 +8637,10 @@
       <w:color w:val="404040" w:themeColor="text1" w:themeTint="BF"/>
     </w:rPr>
   </w:style>
-  <w:style w:type="character" w:customStyle="1" w:styleId="22">
-    <w:name w:val="Цитата 2 Знак"/>
-    <w:basedOn w:val="a4"/>
-    <w:link w:val="21"/>
+  <w:style w:type="character" w:customStyle="1" w:styleId="QuoteChar">
+    <w:name w:val="Quote Char"/>
+    <w:basedOn w:val="DefaultParagraphFont"/>
+    <w:link w:val="Quote"/>
     <w:uiPriority w:val="29"/>
     <w:rsid w:val="00313BD4"/>
     <w:rPr>
@@ -7999,9 +8649,9 @@
       <w:color w:val="404040" w:themeColor="text1" w:themeTint="BF"/>
     </w:rPr>
   </w:style>
-  <w:style w:type="paragraph" w:styleId="ab">
+  <w:style w:type="paragraph" w:styleId="ListParagraph">
     <w:name w:val="List Paragraph"/>
-    <w:basedOn w:val="a2"/>
+    <w:basedOn w:val="Normal"/>
     <w:uiPriority w:val="34"/>
     <w:qFormat/>
     <w:rsid w:val="00313BD4"/>
@@ -8010,9 +8660,9 @@
       <w:contextualSpacing/>
     </w:pPr>
   </w:style>
-  <w:style w:type="character" w:styleId="ac">
+  <w:style w:type="character" w:styleId="IntenseEmphasis">
     <w:name w:val="Intense Emphasis"/>
-    <w:basedOn w:val="a4"/>
+    <w:basedOn w:val="DefaultParagraphFont"/>
     <w:uiPriority w:val="21"/>
     <w:qFormat/>
     <w:rsid w:val="00313BD4"/>
@@ -8022,11 +8672,11 @@
       <w:color w:val="0F4761" w:themeColor="accent1" w:themeShade="BF"/>
     </w:rPr>
   </w:style>
-  <w:style w:type="paragraph" w:styleId="ad">
+  <w:style w:type="paragraph" w:styleId="IntenseQuote">
     <w:name w:val="Intense Quote"/>
-    <w:basedOn w:val="a2"/>
-    <w:next w:val="a2"/>
-    <w:link w:val="ae"/>
+    <w:basedOn w:val="Normal"/>
+    <w:next w:val="Normal"/>
+    <w:link w:val="IntenseQuoteChar"/>
     <w:uiPriority w:val="30"/>
     <w:qFormat/>
     <w:rsid w:val="00313BD4"/>
@@ -8045,10 +8695,10 @@
       <w:color w:val="0F4761" w:themeColor="accent1" w:themeShade="BF"/>
     </w:rPr>
   </w:style>
-  <w:style w:type="character" w:customStyle="1" w:styleId="ae">
-    <w:name w:val="Выделенная цитата Знак"/>
-    <w:basedOn w:val="a4"/>
-    <w:link w:val="ad"/>
+  <w:style w:type="character" w:customStyle="1" w:styleId="IntenseQuoteChar">
+    <w:name w:val="Intense Quote Char"/>
+    <w:basedOn w:val="DefaultParagraphFont"/>
+    <w:link w:val="IntenseQuote"/>
     <w:uiPriority w:val="30"/>
     <w:rsid w:val="00313BD4"/>
     <w:rPr>
@@ -8057,9 +8707,9 @@
       <w:color w:val="0F4761" w:themeColor="accent1" w:themeShade="BF"/>
     </w:rPr>
   </w:style>
-  <w:style w:type="character" w:styleId="af">
+  <w:style w:type="character" w:styleId="IntenseReference">
     <w:name w:val="Intense Reference"/>
-    <w:basedOn w:val="a4"/>
+    <w:basedOn w:val="DefaultParagraphFont"/>
     <w:uiPriority w:val="32"/>
     <w:qFormat/>
     <w:rsid w:val="00313BD4"/>
@@ -8071,10 +8721,10 @@
       <w:spacing w:val="5"/>
     </w:rPr>
   </w:style>
-  <w:style w:type="paragraph" w:customStyle="1" w:styleId="a3">
+  <w:style w:type="paragraph" w:customStyle="1" w:styleId="a2">
     <w:name w:val="Основной"/>
-    <w:basedOn w:val="a2"/>
-    <w:link w:val="af0"/>
+    <w:basedOn w:val="Normal"/>
+    <w:link w:val="a3"/>
     <w:qFormat/>
     <w:rsid w:val="00F31BF1"/>
     <w:pPr>
@@ -8082,19 +8732,19 @@
       <w:ind w:firstLine="709"/>
     </w:pPr>
   </w:style>
-  <w:style w:type="character" w:customStyle="1" w:styleId="af0">
+  <w:style w:type="character" w:customStyle="1" w:styleId="a3">
     <w:name w:val="Основной Знак"/>
-    <w:basedOn w:val="a4"/>
-    <w:link w:val="a3"/>
+    <w:basedOn w:val="DefaultParagraphFont"/>
+    <w:link w:val="a2"/>
     <w:rsid w:val="00F31BF1"/>
     <w:rPr>
       <w:rFonts w:ascii="Times New Roman" w:hAnsi="Times New Roman"/>
       <w:sz w:val="28"/>
     </w:rPr>
   </w:style>
-  <w:style w:type="table" w:styleId="af1">
+  <w:style w:type="table" w:styleId="TableGrid">
     <w:name w:val="Table Grid"/>
-    <w:basedOn w:val="a5"/>
+    <w:basedOn w:val="TableNormal"/>
     <w:uiPriority w:val="59"/>
     <w:rsid w:val="00157D07"/>
     <w:pPr>
@@ -8111,10 +8761,10 @@
       </w:tblBorders>
     </w:tblPr>
   </w:style>
-  <w:style w:type="paragraph" w:styleId="af2">
+  <w:style w:type="paragraph" w:styleId="Header">
     <w:name w:val="header"/>
-    <w:basedOn w:val="a2"/>
-    <w:link w:val="af3"/>
+    <w:basedOn w:val="Normal"/>
+    <w:link w:val="HeaderChar"/>
     <w:uiPriority w:val="99"/>
     <w:unhideWhenUsed/>
     <w:rsid w:val="007B1296"/>
@@ -8125,10 +8775,10 @@
       </w:tabs>
     </w:pPr>
   </w:style>
-  <w:style w:type="character" w:customStyle="1" w:styleId="af3">
-    <w:name w:val="Верхний колонтитул Знак"/>
-    <w:basedOn w:val="a4"/>
-    <w:link w:val="af2"/>
+  <w:style w:type="character" w:customStyle="1" w:styleId="HeaderChar">
+    <w:name w:val="Header Char"/>
+    <w:basedOn w:val="DefaultParagraphFont"/>
+    <w:link w:val="Header"/>
     <w:uiPriority w:val="99"/>
     <w:rsid w:val="007B1296"/>
     <w:rPr>
@@ -8136,10 +8786,10 @@
       <w:sz w:val="28"/>
     </w:rPr>
   </w:style>
-  <w:style w:type="paragraph" w:styleId="af4">
+  <w:style w:type="paragraph" w:styleId="Footer">
     <w:name w:val="footer"/>
-    <w:basedOn w:val="a2"/>
-    <w:link w:val="af5"/>
+    <w:basedOn w:val="Normal"/>
+    <w:link w:val="FooterChar"/>
     <w:uiPriority w:val="99"/>
     <w:unhideWhenUsed/>
     <w:rsid w:val="007B1296"/>
@@ -8150,10 +8800,10 @@
       </w:tabs>
     </w:pPr>
   </w:style>
-  <w:style w:type="character" w:customStyle="1" w:styleId="af5">
-    <w:name w:val="Нижний колонтитул Знак"/>
-    <w:basedOn w:val="a4"/>
-    <w:link w:val="af4"/>
+  <w:style w:type="character" w:customStyle="1" w:styleId="FooterChar">
+    <w:name w:val="Footer Char"/>
+    <w:basedOn w:val="DefaultParagraphFont"/>
+    <w:link w:val="Footer"/>
     <w:uiPriority w:val="99"/>
     <w:rsid w:val="007B1296"/>
     <w:rPr>
@@ -8163,8 +8813,8 @@
   </w:style>
   <w:style w:type="paragraph" w:customStyle="1" w:styleId="a1">
     <w:name w:val="Список маркированный"/>
-    <w:basedOn w:val="a3"/>
-    <w:link w:val="af6"/>
+    <w:basedOn w:val="a2"/>
+    <w:link w:val="a4"/>
     <w:qFormat/>
     <w:rsid w:val="006B2E38"/>
     <w:pPr>
@@ -8173,9 +8823,9 @@
       </w:numPr>
     </w:pPr>
   </w:style>
-  <w:style w:type="character" w:customStyle="1" w:styleId="af6">
+  <w:style w:type="character" w:customStyle="1" w:styleId="a4">
     <w:name w:val="Список маркированный Знак"/>
-    <w:basedOn w:val="af0"/>
+    <w:basedOn w:val="a3"/>
     <w:link w:val="a1"/>
     <w:rsid w:val="006B2E38"/>
     <w:rPr>
@@ -8183,10 +8833,10 @@
       <w:sz w:val="28"/>
     </w:rPr>
   </w:style>
-  <w:style w:type="paragraph" w:styleId="41">
+  <w:style w:type="paragraph" w:styleId="TOC4">
     <w:name w:val="toc 4"/>
-    <w:basedOn w:val="a2"/>
-    <w:next w:val="a2"/>
+    <w:basedOn w:val="Normal"/>
+    <w:next w:val="Normal"/>
     <w:autoRedefine/>
     <w:uiPriority w:val="39"/>
     <w:semiHidden/>
@@ -8197,10 +8847,10 @@
       <w:ind w:left="840"/>
     </w:pPr>
   </w:style>
-  <w:style w:type="paragraph" w:styleId="12">
+  <w:style w:type="paragraph" w:styleId="TOC1">
     <w:name w:val="toc 1"/>
-    <w:basedOn w:val="a2"/>
-    <w:next w:val="a2"/>
+    <w:basedOn w:val="Normal"/>
+    <w:next w:val="Normal"/>
     <w:autoRedefine/>
     <w:uiPriority w:val="39"/>
     <w:unhideWhenUsed/>
@@ -8210,10 +8860,10 @@
       <w:ind w:left="709" w:right="284"/>
     </w:pPr>
   </w:style>
-  <w:style w:type="paragraph" w:styleId="23">
+  <w:style w:type="paragraph" w:styleId="TOC2">
     <w:name w:val="toc 2"/>
-    <w:basedOn w:val="12"/>
-    <w:next w:val="a2"/>
+    <w:basedOn w:val="TOC1"/>
+    <w:next w:val="Normal"/>
     <w:autoRedefine/>
     <w:uiPriority w:val="39"/>
     <w:unhideWhenUsed/>
@@ -8225,10 +8875,10 @@
       <w:ind w:left="992"/>
     </w:pPr>
   </w:style>
-  <w:style w:type="paragraph" w:styleId="31">
+  <w:style w:type="paragraph" w:styleId="TOC3">
     <w:name w:val="toc 3"/>
-    <w:basedOn w:val="23"/>
-    <w:next w:val="a2"/>
+    <w:basedOn w:val="TOC2"/>
+    <w:next w:val="Normal"/>
     <w:autoRedefine/>
     <w:uiPriority w:val="39"/>
     <w:unhideWhenUsed/>
@@ -8237,9 +8887,9 @@
       <w:ind w:left="1276"/>
     </w:pPr>
   </w:style>
-  <w:style w:type="character" w:styleId="af7">
+  <w:style w:type="character" w:styleId="Hyperlink">
     <w:name w:val="Hyperlink"/>
-    <w:basedOn w:val="a4"/>
+    <w:basedOn w:val="DefaultParagraphFont"/>
     <w:uiPriority w:val="99"/>
     <w:unhideWhenUsed/>
     <w:qFormat/>
@@ -8249,17 +8899,17 @@
       <w:u w:val="single"/>
     </w:rPr>
   </w:style>
-  <w:style w:type="paragraph" w:customStyle="1" w:styleId="af8">
+  <w:style w:type="paragraph" w:customStyle="1" w:styleId="a5">
     <w:name w:val="Заголовок Содержание"/>
-    <w:basedOn w:val="a7"/>
-    <w:link w:val="af9"/>
+    <w:basedOn w:val="Title"/>
+    <w:link w:val="a6"/>
     <w:qFormat/>
     <w:rsid w:val="00C02CA6"/>
   </w:style>
-  <w:style w:type="character" w:customStyle="1" w:styleId="af9">
+  <w:style w:type="character" w:customStyle="1" w:styleId="a6">
     <w:name w:val="Заголовок Содержание Знак"/>
-    <w:basedOn w:val="a8"/>
-    <w:link w:val="af8"/>
+    <w:basedOn w:val="TitleChar"/>
+    <w:link w:val="a5"/>
     <w:rsid w:val="00C02CA6"/>
     <w:rPr>
       <w:rFonts w:ascii="Times New Roman" w:eastAsiaTheme="majorEastAsia" w:hAnsi="Times New Roman" w:cstheme="majorBidi"/>
@@ -8271,9 +8921,9 @@
       <w:szCs w:val="56"/>
     </w:rPr>
   </w:style>
-  <w:style w:type="paragraph" w:styleId="afa">
+  <w:style w:type="paragraph" w:styleId="NormalWeb">
     <w:name w:val="Normal (Web)"/>
-    <w:basedOn w:val="a2"/>
+    <w:basedOn w:val="Normal"/>
     <w:uiPriority w:val="99"/>
     <w:semiHidden/>
     <w:unhideWhenUsed/>
@@ -8293,8 +8943,8 @@
   </w:style>
   <w:style w:type="paragraph" w:customStyle="1" w:styleId="a0">
     <w:name w:val="Список буквенный"/>
-    <w:basedOn w:val="a3"/>
-    <w:link w:val="afb"/>
+    <w:basedOn w:val="a2"/>
+    <w:link w:val="a7"/>
     <w:qFormat/>
     <w:rsid w:val="00A57474"/>
     <w:pPr>
@@ -8303,9 +8953,9 @@
       </w:numPr>
     </w:pPr>
   </w:style>
-  <w:style w:type="character" w:customStyle="1" w:styleId="afb">
+  <w:style w:type="character" w:customStyle="1" w:styleId="a7">
     <w:name w:val="Список буквенный Знак"/>
-    <w:basedOn w:val="af0"/>
+    <w:basedOn w:val="a3"/>
     <w:link w:val="a0"/>
     <w:rsid w:val="00A57474"/>
     <w:rPr>
@@ -8315,8 +8965,8 @@
   </w:style>
   <w:style w:type="paragraph" w:customStyle="1" w:styleId="a">
     <w:name w:val="Список нумерованный"/>
-    <w:basedOn w:val="a3"/>
-    <w:link w:val="afc"/>
+    <w:basedOn w:val="a2"/>
+    <w:link w:val="a8"/>
     <w:qFormat/>
     <w:rsid w:val="00F44D11"/>
     <w:pPr>
@@ -8325,9 +8975,9 @@
       </w:numPr>
     </w:pPr>
   </w:style>
-  <w:style w:type="character" w:customStyle="1" w:styleId="afc">
+  <w:style w:type="character" w:customStyle="1" w:styleId="a8">
     <w:name w:val="Список нумерованный Знак"/>
-    <w:basedOn w:val="af0"/>
+    <w:basedOn w:val="a3"/>
     <w:link w:val="a"/>
     <w:rsid w:val="00F44D11"/>
     <w:rPr>
@@ -8335,10 +8985,10 @@
       <w:sz w:val="28"/>
     </w:rPr>
   </w:style>
-  <w:style w:type="paragraph" w:customStyle="1" w:styleId="afd">
+  <w:style w:type="paragraph" w:customStyle="1" w:styleId="a9">
     <w:name w:val="Рисунок"/>
-    <w:basedOn w:val="a2"/>
-    <w:next w:val="a2"/>
+    <w:basedOn w:val="Normal"/>
+    <w:next w:val="Normal"/>
     <w:qFormat/>
     <w:rsid w:val="00D160AE"/>
     <w:pPr>
@@ -8352,11 +9002,11 @@
       <w:szCs w:val="28"/>
     </w:rPr>
   </w:style>
-  <w:style w:type="paragraph" w:customStyle="1" w:styleId="afe">
+  <w:style w:type="paragraph" w:customStyle="1" w:styleId="aa">
     <w:name w:val="Подпись рисунка"/>
-    <w:basedOn w:val="a2"/>
-    <w:next w:val="a3"/>
-    <w:link w:val="aff"/>
+    <w:basedOn w:val="Normal"/>
+    <w:next w:val="a2"/>
+    <w:link w:val="ab"/>
     <w:qFormat/>
     <w:rsid w:val="00CB5F04"/>
     <w:pPr>
@@ -8364,20 +9014,20 @@
       <w:jc w:val="center"/>
     </w:pPr>
   </w:style>
-  <w:style w:type="character" w:customStyle="1" w:styleId="aff">
+  <w:style w:type="character" w:customStyle="1" w:styleId="ab">
     <w:name w:val="Подпись рисунка Знак"/>
-    <w:basedOn w:val="a4"/>
-    <w:link w:val="afe"/>
+    <w:basedOn w:val="DefaultParagraphFont"/>
+    <w:link w:val="aa"/>
     <w:rsid w:val="00CB5F04"/>
     <w:rPr>
       <w:rFonts w:ascii="Times New Roman" w:hAnsi="Times New Roman"/>
       <w:sz w:val="28"/>
     </w:rPr>
   </w:style>
-  <w:style w:type="paragraph" w:customStyle="1" w:styleId="aff0">
+  <w:style w:type="paragraph" w:customStyle="1" w:styleId="ac">
     <w:name w:val="Листинг"/>
-    <w:basedOn w:val="a2"/>
-    <w:link w:val="aff1"/>
+    <w:basedOn w:val="Normal"/>
+    <w:link w:val="ad"/>
     <w:qFormat/>
     <w:rsid w:val="00D51EAF"/>
     <w:pPr>
@@ -8391,10 +9041,10 @@
       <w:szCs w:val="20"/>
     </w:rPr>
   </w:style>
-  <w:style w:type="character" w:customStyle="1" w:styleId="aff1">
+  <w:style w:type="character" w:customStyle="1" w:styleId="ad">
     <w:name w:val="Листинг Знак"/>
-    <w:basedOn w:val="a4"/>
-    <w:link w:val="aff0"/>
+    <w:basedOn w:val="DefaultParagraphFont"/>
+    <w:link w:val="ac"/>
     <w:rsid w:val="00D51EAF"/>
     <w:rPr>
       <w:rFonts w:ascii="Courier New" w:hAnsi="Courier New" w:cs="Courier New"/>
@@ -8402,9 +9052,9 @@
       <w:szCs w:val="20"/>
     </w:rPr>
   </w:style>
-  <w:style w:type="paragraph" w:customStyle="1" w:styleId="aff2">
+  <w:style w:type="paragraph" w:customStyle="1" w:styleId="ae">
     <w:name w:val="Подпись элемента"/>
-    <w:basedOn w:val="a2"/>
+    <w:basedOn w:val="Normal"/>
     <w:qFormat/>
     <w:rsid w:val="00DE499E"/>
     <w:pPr>
@@ -8412,9 +9062,9 @@
       <w:spacing w:before="482" w:after="642"/>
     </w:pPr>
   </w:style>
-  <w:style w:type="character" w:styleId="aff3">
+  <w:style w:type="character" w:styleId="CommentReference">
     <w:name w:val="annotation reference"/>
-    <w:basedOn w:val="a4"/>
+    <w:basedOn w:val="DefaultParagraphFont"/>
     <w:uiPriority w:val="99"/>
     <w:semiHidden/>
     <w:unhideWhenUsed/>
@@ -8424,10 +9074,10 @@
       <w:szCs w:val="16"/>
     </w:rPr>
   </w:style>
-  <w:style w:type="paragraph" w:styleId="aff4">
+  <w:style w:type="paragraph" w:styleId="CommentText">
     <w:name w:val="annotation text"/>
-    <w:basedOn w:val="a2"/>
-    <w:link w:val="aff5"/>
+    <w:basedOn w:val="Normal"/>
+    <w:link w:val="CommentTextChar"/>
     <w:uiPriority w:val="99"/>
     <w:unhideWhenUsed/>
     <w:rsid w:val="003E2F9B"/>
@@ -8443,10 +9093,10 @@
       <w14:ligatures w14:val="none"/>
     </w:rPr>
   </w:style>
-  <w:style w:type="character" w:customStyle="1" w:styleId="aff5">
-    <w:name w:val="Текст примечания Знак"/>
-    <w:basedOn w:val="a4"/>
-    <w:link w:val="aff4"/>
+  <w:style w:type="character" w:customStyle="1" w:styleId="CommentTextChar">
+    <w:name w:val="Comment Text Char"/>
+    <w:basedOn w:val="DefaultParagraphFont"/>
+    <w:link w:val="CommentText"/>
     <w:uiPriority w:val="99"/>
     <w:rsid w:val="003E2F9B"/>
     <w:rPr>
@@ -8458,12 +9108,12 @@
   </w:style>
   <w:style w:type="character" w:customStyle="1" w:styleId="whitespace-normal">
     <w:name w:val="whitespace-normal"/>
-    <w:basedOn w:val="a4"/>
+    <w:basedOn w:val="DefaultParagraphFont"/>
     <w:rsid w:val="00D91790"/>
   </w:style>
   <w:style w:type="table" w:customStyle="1" w:styleId="PlainTable21">
     <w:name w:val="Plain Table 21"/>
-    <w:basedOn w:val="a5"/>
+    <w:basedOn w:val="TableNormal"/>
     <w:uiPriority w:val="59"/>
     <w:rsid w:val="005F261C"/>
     <w:pPr>
@@ -8550,7 +9200,7 @@
   </w:style>
   <w:style w:type="character" w:customStyle="1" w:styleId="UnresolvedMention1">
     <w:name w:val="Unresolved Mention1"/>
-    <w:basedOn w:val="a4"/>
+    <w:basedOn w:val="DefaultParagraphFont"/>
     <w:uiPriority w:val="99"/>
     <w:semiHidden/>
     <w:unhideWhenUsed/>
@@ -8560,10 +9210,10 @@
       <w:shd w:val="clear" w:color="auto" w:fill="E1DFDD"/>
     </w:rPr>
   </w:style>
-  <w:style w:type="paragraph" w:styleId="aff6">
+  <w:style w:type="paragraph" w:styleId="BalloonText">
     <w:name w:val="Balloon Text"/>
-    <w:basedOn w:val="a2"/>
-    <w:link w:val="aff7"/>
+    <w:basedOn w:val="Normal"/>
+    <w:link w:val="BalloonTextChar"/>
     <w:uiPriority w:val="99"/>
     <w:semiHidden/>
     <w:unhideWhenUsed/>
@@ -8574,10 +9224,10 @@
       <w:szCs w:val="16"/>
     </w:rPr>
   </w:style>
-  <w:style w:type="character" w:customStyle="1" w:styleId="aff7">
-    <w:name w:val="Текст выноски Знак"/>
-    <w:basedOn w:val="a4"/>
-    <w:link w:val="aff6"/>
+  <w:style w:type="character" w:customStyle="1" w:styleId="BalloonTextChar">
+    <w:name w:val="Balloon Text Char"/>
+    <w:basedOn w:val="DefaultParagraphFont"/>
+    <w:link w:val="BalloonText"/>
     <w:uiPriority w:val="99"/>
     <w:semiHidden/>
     <w:rsid w:val="001F6761"/>
@@ -8589,8 +9239,8 @@
   </w:style>
   <w:style w:type="paragraph" w:customStyle="1" w:styleId="1">
     <w:name w:val="Стиль1"/>
-    <w:basedOn w:val="a2"/>
-    <w:link w:val="13"/>
+    <w:basedOn w:val="Normal"/>
+    <w:link w:val="10"/>
     <w:qFormat/>
     <w:rsid w:val="00A91042"/>
     <w:pPr>
@@ -8609,9 +9259,9 @@
       <w14:ligatures w14:val="none"/>
     </w:rPr>
   </w:style>
-  <w:style w:type="character" w:customStyle="1" w:styleId="13">
+  <w:style w:type="character" w:customStyle="1" w:styleId="10">
     <w:name w:val="Стиль1 Знак"/>
-    <w:basedOn w:val="a4"/>
+    <w:basedOn w:val="DefaultParagraphFont"/>
     <w:link w:val="1"/>
     <w:rsid w:val="00A91042"/>
     <w:rPr>
@@ -8622,10 +9272,10 @@
       <w14:ligatures w14:val="none"/>
     </w:rPr>
   </w:style>
-  <w:style w:type="paragraph" w:customStyle="1" w:styleId="14">
+  <w:style w:type="paragraph" w:customStyle="1" w:styleId="11">
     <w:name w:val="Рисунок 1"/>
-    <w:basedOn w:val="afa"/>
-    <w:link w:val="15"/>
+    <w:basedOn w:val="NormalWeb"/>
+    <w:link w:val="12"/>
     <w:qFormat/>
     <w:rsid w:val="003A0EE4"/>
     <w:pPr>
@@ -8633,10 +9283,10 @@
       <w:jc w:val="center"/>
     </w:pPr>
   </w:style>
-  <w:style w:type="character" w:customStyle="1" w:styleId="15">
+  <w:style w:type="character" w:customStyle="1" w:styleId="12">
     <w:name w:val="Рисунок 1 Знак"/>
-    <w:basedOn w:val="a4"/>
-    <w:link w:val="14"/>
+    <w:basedOn w:val="DefaultParagraphFont"/>
+    <w:link w:val="11"/>
     <w:rsid w:val="003A0EE4"/>
     <w:rPr>
       <w:rFonts w:ascii="Times New Roman" w:eastAsia="Times New Roman" w:hAnsi="Times New Roman" w:cs="Times New Roman"/>

</xml_diff>